<commit_message>
revision sent to coauthoes
</commit_message>
<xml_diff>
--- a/JASA_Response_Letter/Revision/JASA_naturalness_comment_letter_2026_revision.docx
+++ b/JASA_Response_Letter/Revision/JASA_naturalness_comment_letter_2026_revision.docx
@@ -390,7 +390,14 @@
           <w:rFonts w:cstheme="minorHAnsi"/>
           <w:lang w:val="en-US"/>
         </w:rPr>
-        <w:t xml:space="preserve"> (</w:t>
+        <w:t xml:space="preserve"> </w:t>
+      </w:r>
+      <w:r>
+        <w:rPr>
+          <w:rFonts w:cstheme="minorHAnsi"/>
+          <w:lang w:val="en-US"/>
+        </w:rPr>
+        <w:t>(</w:t>
       </w:r>
       <w:hyperlink r:id="rId5" w:history="1">
         <w:r>
@@ -443,16 +450,32 @@
         </w:rPr>
         <w:t xml:space="preserve">, E-Mail: </w:t>
       </w:r>
-      <w:hyperlink r:id="rId6" w:history="1">
-        <w:r>
-          <w:rPr>
-            <w:rStyle w:val="Hyperlink"/>
-            <w:rFonts w:cstheme="minorHAnsi"/>
-            <w:lang w:val="en-US"/>
-          </w:rPr>
-          <w:t>christine.nussbaum@uni-jena.de</w:t>
-        </w:r>
-      </w:hyperlink>
+      <w:r>
+        <w:fldChar w:fldCharType="begin"/>
+      </w:r>
+      <w:r>
+        <w:rPr>
+          <w:lang w:val="en-US"/>
+          <w:rPrChange w:id="1" w:author="christine.nussbaum" w:date="2026-05-15T13:56:00Z" w16du:dateUtc="2026-05-15T11:56:00Z">
+            <w:rPr/>
+          </w:rPrChange>
+        </w:rPr>
+        <w:instrText>HYPERLINK "mailto:christine.nussbaum@uni-jena.de"</w:instrText>
+      </w:r>
+      <w:r>
+        <w:fldChar w:fldCharType="separate"/>
+      </w:r>
+      <w:r>
+        <w:rPr>
+          <w:rStyle w:val="Hyperlink"/>
+          <w:rFonts w:cstheme="minorHAnsi"/>
+          <w:lang w:val="en-US"/>
+        </w:rPr>
+        <w:t>christine.nussbaum@uni-jena.de</w:t>
+      </w:r>
+      <w:r>
+        <w:fldChar w:fldCharType="end"/>
+      </w:r>
       <w:r>
         <w:rPr>
           <w:rFonts w:cstheme="minorHAnsi"/>
@@ -644,7 +667,7 @@
             <w:rPr>
               <w:lang w:val="en-US"/>
             </w:rPr>
-            <w:instrText>ADDIN CitaviPlaceholder{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}</w:instrText>
+            <w:instrText>ADDIN CitaviPlaceholder{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}</w:instrText>
           </w:r>
           <w:r>
             <w:rPr>
@@ -707,7 +730,7 @@
             <w:rPr>
               <w:lang w:val="en-US"/>
             </w:rPr>
-            <w:instrText>ADDIN CitaviPlaceholder{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}</w:instrText>
+            <w:instrText>ADDIN CitaviPlaceholder{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}</w:instrText>
           </w:r>
           <w:r>
             <w:rPr>
@@ -758,7 +781,7 @@
             <w:rPr>
               <w:lang w:val="en-US"/>
             </w:rPr>
-            <w:instrText>ADDIN CitaviPlaceholder{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}</w:instrText>
+            <w:instrText>ADDIN CitaviPlaceholder{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}</w:instrText>
           </w:r>
           <w:r>
             <w:rPr>
@@ -901,7 +924,21 @@
           <w:color w:val="C00000"/>
           <w:lang w:val="en-US"/>
         </w:rPr>
-        <w:t xml:space="preserve">, we resolve these </w:t>
+        <w:t xml:space="preserve">, </w:t>
+      </w:r>
+      <w:r>
+        <w:rPr>
+          <w:color w:val="C00000"/>
+          <w:lang w:val="en-US"/>
+        </w:rPr>
+        <w:t xml:space="preserve">we unpack these criticisms, and </w:t>
+      </w:r>
+      <w:r>
+        <w:rPr>
+          <w:color w:val="C00000"/>
+          <w:lang w:val="en-US"/>
+        </w:rPr>
+        <w:t xml:space="preserve">we resolve these </w:t>
       </w:r>
       <w:r>
         <w:rPr>
@@ -922,14 +959,7 @@
           <w:color w:val="C00000"/>
           <w:lang w:val="en-US"/>
         </w:rPr>
-        <w:t xml:space="preserve"> </w:t>
-      </w:r>
-      <w:r>
-        <w:rPr>
-          <w:color w:val="C00000"/>
-          <w:lang w:val="en-US"/>
-        </w:rPr>
-        <w:t>showing how self-voice research is easily integrated into our framework and</w:t>
+        <w:t xml:space="preserve"> showing how self-voice research is easily integrated into our framework and</w:t>
       </w:r>
       <w:r>
         <w:rPr>
@@ -1058,7 +1088,7 @@
             <w:rPr>
               <w:lang w:val="en-US"/>
             </w:rPr>
-            <w:instrText>ADDIN CitaviPlaceholder{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}</w:instrText>
+            <w:instrText>ADDIN CitaviPlaceholder{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}</w:instrText>
           </w:r>
           <w:r>
             <w:rPr>
@@ -1161,7 +1191,7 @@
               <w:color w:val="C00000"/>
               <w:lang w:val="en-US"/>
             </w:rPr>
-            <w:instrText>ADDIN CitaviPlaceholder{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}</w:instrText>
+            <w:instrText>ADDIN CitaviPlaceholder{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}</w:instrText>
           </w:r>
           <w:r>
             <w:rPr>
@@ -1368,7 +1398,7 @@
             <w:rPr>
               <w:lang w:val="en-US"/>
             </w:rPr>
-            <w:instrText>ADDIN CitaviPlaceholder{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}</w:instrText>
+            <w:instrText>ADDIN CitaviPlaceholder{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}</w:instrText>
           </w:r>
           <w:r>
             <w:rPr>
@@ -1619,7 +1649,7 @@
             <w:rPr>
               <w:lang w:val="en-US"/>
             </w:rPr>
-            <w:instrText>ADDIN CitaviPlaceholder{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}</w:instrText>
+            <w:instrText>ADDIN CitaviPlaceholder{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}</w:instrText>
           </w:r>
           <w:r>
             <w:rPr>
@@ -1670,7 +1700,7 @@
             <w:rPr>
               <w:lang w:val="en-US"/>
             </w:rPr>
-            <w:instrText>ADDIN CitaviPlaceholder{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}</w:instrText>
+            <w:instrText>ADDIN CitaviPlaceholder{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}</w:instrText>
           </w:r>
           <w:r>
             <w:rPr>
@@ -1859,7 +1889,7 @@
             <w:rPr>
               <w:lang w:val="en-US"/>
             </w:rPr>
-            <w:instrText>ADDIN CitaviPlaceholder{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}</w:instrText>
+            <w:instrText>ADDIN CitaviPlaceholder{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}</w:instrText>
           </w:r>
           <w:r>
             <w:rPr>
@@ -1910,7 +1940,7 @@
             <w:rPr>
               <w:lang w:val="en-US"/>
             </w:rPr>
-            <w:instrText>ADDIN CitaviPlaceholder{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}</w:instrText>
+            <w:instrText>ADDIN CitaviPlaceholder{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}</w:instrText>
           </w:r>
           <w:r>
             <w:rPr>
@@ -2003,6 +2033,7 @@
       <w:pPr>
         <w:spacing w:line="480" w:lineRule="auto"/>
         <w:rPr>
+          <w:color w:val="C00000"/>
           <w:lang w:val="en-US"/>
         </w:rPr>
       </w:pPr>
@@ -2010,7 +2041,27 @@
         <w:rPr>
           <w:lang w:val="en-US"/>
         </w:rPr>
-        <w:t xml:space="preserve">We welcome the opportunity to reply to Pinheiro´s letter. </w:t>
+        <w:t xml:space="preserve">We welcome the opportunity to </w:t>
+      </w:r>
+      <w:r>
+        <w:rPr>
+          <w:color w:val="C00000"/>
+          <w:lang w:val="en-US"/>
+        </w:rPr>
+        <w:t>comment on</w:t>
+      </w:r>
+      <w:r>
+        <w:rPr>
+          <w:color w:val="C00000"/>
+          <w:lang w:val="en-US"/>
+        </w:rPr>
+        <w:t xml:space="preserve"> </w:t>
+      </w:r>
+      <w:r>
+        <w:rPr>
+          <w:lang w:val="en-US"/>
+        </w:rPr>
+        <w:t xml:space="preserve">Pinheiro´s letter. </w:t>
       </w:r>
       <w:r>
         <w:rPr>
@@ -2022,38 +2073,38 @@
         <w:rPr>
           <w:lang w:val="en-US"/>
         </w:rPr>
-        <w:t xml:space="preserve">, which includes interdisciplinary (e.g., neurocognitive, </w:t>
-      </w:r>
-      <w:r>
-        <w:rPr>
-          <w:lang w:val="en-US"/>
-        </w:rPr>
-        <w:t>acoustic</w:t>
-      </w:r>
-      <w:r>
-        <w:rPr>
-          <w:lang w:val="en-US"/>
-        </w:rPr>
-        <w:t>, philosophical,</w:t>
-      </w:r>
-      <w:r>
-        <w:rPr>
-          <w:lang w:val="en-US"/>
-        </w:rPr>
-        <w:t xml:space="preserve"> and medical) perspectives. Furthermore, we agree that impressions of naturalness in self-voice evaluation deserve </w:t>
+        <w:t>,</w:t>
+      </w:r>
+      <w:r>
+        <w:rPr>
+          <w:lang w:val="en-US"/>
+        </w:rPr>
+        <w:t xml:space="preserve"> and </w:t>
+      </w:r>
+      <w:r>
+        <w:rPr>
+          <w:lang w:val="en-US"/>
+        </w:rPr>
+        <w:t xml:space="preserve">we agree that impressions of naturalness in self-voice evaluation deserve </w:t>
+      </w:r>
+      <w:r>
+        <w:rPr>
+          <w:lang w:val="en-US"/>
+        </w:rPr>
+        <w:t xml:space="preserve">more </w:t>
+      </w:r>
+      <w:r>
+        <w:rPr>
+          <w:lang w:val="en-US"/>
+        </w:rPr>
+        <w:t xml:space="preserve">attention. Above all, however, we want to emphasize that this is not in conflict but in complete accordance with our </w:t>
       </w:r>
       <w:r>
         <w:rPr>
           <w:lang w:val="en-US"/>
         </w:rPr>
         <w:lastRenderedPageBreak/>
-        <w:t xml:space="preserve">more </w:t>
-      </w:r>
-      <w:r>
-        <w:rPr>
-          <w:lang w:val="en-US"/>
-        </w:rPr>
-        <w:t>attention. Above all, however, we want to emphasize that this is not in conflict but in complete accordance with our proposed framework. The points raised by</w:t>
+        <w:t>proposed framework. The points raised by</w:t>
       </w:r>
       <w:r>
         <w:rPr>
@@ -2084,7 +2135,7 @@
             <w:rPr>
               <w:lang w:val="en-US"/>
             </w:rPr>
-            <w:instrText>ADDIN CitaviPlaceholder{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}</w:instrText>
+            <w:instrText>ADDIN CitaviPlaceholder{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}</w:instrText>
           </w:r>
           <w:r>
             <w:rPr>
@@ -2135,7 +2186,7 @@
             <w:rPr>
               <w:lang w:val="en-US"/>
             </w:rPr>
-            <w:instrText>ADDIN CitaviPlaceholder{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}</w:instrText>
+            <w:instrText>ADDIN CitaviPlaceholder{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}</w:instrText>
           </w:r>
           <w:r>
             <w:rPr>
@@ -2192,7 +2243,7 @@
             <w:rPr>
               <w:lang w:val="en-US"/>
             </w:rPr>
-            <w:instrText>ADDIN CitaviPlaceholder{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}</w:instrText>
+            <w:instrText>ADDIN CitaviPlaceholder{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}</w:instrText>
           </w:r>
           <w:r>
             <w:rPr>
@@ -2243,7 +2294,7 @@
             <w:rPr>
               <w:lang w:val="en-US"/>
             </w:rPr>
-            <w:instrText>ADDIN CitaviPlaceholder{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}</w:instrText>
+            <w:instrText>ADDIN CitaviPlaceholder{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}</w:instrText>
           </w:r>
           <w:r>
             <w:rPr>
@@ -2269,132 +2320,98 @@
         <w:rPr>
           <w:lang w:val="en-US"/>
         </w:rPr>
-        <w:t>, and a</w:t>
-      </w:r>
-      <w:r>
-        <w:rPr>
-          <w:lang w:val="en-US"/>
-        </w:rPr>
-        <w:t>ny apparent contradiction stems from misconceptions of our framework</w:t>
-      </w:r>
-      <w:r>
-        <w:rPr>
-          <w:lang w:val="en-US"/>
-        </w:rPr>
         <w:t xml:space="preserve">. </w:t>
       </w:r>
-      <w:commentRangeStart w:id="1"/>
-      <w:r>
-        <w:rPr>
-          <w:lang w:val="en-US"/>
-        </w:rPr>
-        <w:t>O</w:t>
-      </w:r>
-      <w:r>
-        <w:rPr>
-          <w:lang w:val="en-US"/>
-        </w:rPr>
-        <w:t xml:space="preserve">ur response is </w:t>
-      </w:r>
-      <w:r>
-        <w:rPr>
-          <w:lang w:val="en-US"/>
-        </w:rPr>
-        <w:t xml:space="preserve">twofold: in the first part, we </w:t>
-      </w:r>
-      <w:r>
-        <w:rPr>
-          <w:lang w:val="en-US"/>
-        </w:rPr>
-        <w:t xml:space="preserve">resolve these misunderstandings and </w:t>
-      </w:r>
-      <w:r>
-        <w:rPr>
-          <w:lang w:val="en-US"/>
-        </w:rPr>
-        <w:t xml:space="preserve">outline how self-voice perception fits well within </w:t>
-      </w:r>
-      <w:r>
-        <w:rPr>
-          <w:lang w:val="en-US"/>
-        </w:rPr>
-        <w:t>our</w:t>
-      </w:r>
-      <w:r>
-        <w:rPr>
-          <w:lang w:val="en-US"/>
-        </w:rPr>
-        <w:t xml:space="preserve"> proposed </w:t>
-      </w:r>
-      <w:r>
-        <w:rPr>
-          <w:lang w:val="en-US"/>
-        </w:rPr>
-        <w:t>model</w:t>
-      </w:r>
-      <w:r>
-        <w:rPr>
-          <w:lang w:val="en-US"/>
-        </w:rPr>
-        <w:t>.</w:t>
-      </w:r>
-      <w:r>
-        <w:rPr>
-          <w:lang w:val="en-US"/>
-        </w:rPr>
-        <w:t xml:space="preserve"> In the second part, we expand on the </w:t>
-      </w:r>
-      <w:r>
-        <w:rPr>
+      <w:r>
+        <w:rPr>
+          <w:color w:val="C00000"/>
+          <w:lang w:val="en-US"/>
+        </w:rPr>
+        <w:t>In the next two paragraphs,</w:t>
+      </w:r>
+      <w:r>
+        <w:rPr>
+          <w:color w:val="C00000"/>
+          <w:lang w:val="en-US"/>
+        </w:rPr>
+        <w:t xml:space="preserve"> </w:t>
+      </w:r>
+      <w:r>
+        <w:rPr>
+          <w:color w:val="C00000"/>
+          <w:lang w:val="en-US"/>
+        </w:rPr>
+        <w:t xml:space="preserve">we resolve these potential misunderstandings </w:t>
+      </w:r>
+      <w:r>
+        <w:rPr>
+          <w:color w:val="C00000"/>
+          <w:lang w:val="en-US"/>
+        </w:rPr>
+        <w:t>and</w:t>
+      </w:r>
+      <w:r>
+        <w:rPr>
+          <w:color w:val="C00000"/>
+          <w:lang w:val="en-US"/>
+        </w:rPr>
+        <w:t xml:space="preserve"> show how self-voice research is easily integrated into our framework and especially its concept of authenticity. In the final paragraph, we briefly</w:t>
+      </w:r>
+      <w:r>
+        <w:rPr>
+          <w:color w:val="C00000"/>
+          <w:lang w:val="en-US"/>
+        </w:rPr>
+        <w:t xml:space="preserve"> expand on the </w:t>
+      </w:r>
+      <w:r>
+        <w:rPr>
+          <w:color w:val="C00000"/>
           <w:lang w:val="en-US"/>
         </w:rPr>
         <w:t xml:space="preserve">important </w:t>
       </w:r>
       <w:r>
         <w:rPr>
+          <w:color w:val="C00000"/>
           <w:lang w:val="en-US"/>
         </w:rPr>
         <w:t xml:space="preserve">points Pinheiro </w:t>
       </w:r>
       <w:r>
         <w:rPr>
-          <w:lang w:val="en-US"/>
-        </w:rPr>
-        <w:t>raised and</w:t>
-      </w:r>
-      <w:r>
-        <w:rPr>
-          <w:lang w:val="en-US"/>
-        </w:rPr>
-        <w:t xml:space="preserve"> share </w:t>
-      </w:r>
-      <w:r>
-        <w:rPr>
-          <w:lang w:val="en-US"/>
-        </w:rPr>
-        <w:t xml:space="preserve">our perspective on current challenges around research on self-voice </w:t>
-      </w:r>
-      <w:r>
-        <w:rPr>
+          <w:color w:val="C00000"/>
+          <w:lang w:val="en-US"/>
+        </w:rPr>
+        <w:t xml:space="preserve">raised </w:t>
+      </w:r>
+      <w:r>
+        <w:rPr>
+          <w:color w:val="C00000"/>
+          <w:lang w:val="en-US"/>
+        </w:rPr>
+        <w:t>around</w:t>
+      </w:r>
+      <w:r>
+        <w:rPr>
+          <w:color w:val="C00000"/>
+          <w:lang w:val="en-US"/>
+        </w:rPr>
+        <w:t xml:space="preserve"> current challenges around research on self-voice </w:t>
+      </w:r>
+      <w:r>
+        <w:rPr>
+          <w:color w:val="C00000"/>
           <w:lang w:val="en-US"/>
         </w:rPr>
         <w:t>processing</w:t>
       </w:r>
       <w:r>
         <w:rPr>
+          <w:color w:val="C00000"/>
           <w:lang w:val="en-US"/>
         </w:rPr>
         <w:t xml:space="preserve">. </w:t>
-      </w:r>
-      <w:commentRangeEnd w:id="1"/>
-      <w:r>
-        <w:rPr>
-          <w:rStyle w:val="Kommentarzeichen"/>
-          <w:sz w:val="22"/>
-          <w:szCs w:val="22"/>
-          <w:lang w:val="en-US"/>
-        </w:rPr>
-        <w:commentReference w:id="1"/>
       </w:r>
     </w:p>
     <w:p>
@@ -2432,7 +2449,16 @@
           <w:color w:val="C00000"/>
           <w:lang w:val="en-US"/>
         </w:rPr>
-        <w:t>– an entirely subjective impression</w:t>
+        <w:t xml:space="preserve">– </w:t>
+      </w:r>
+      <w:r>
+        <w:rPr>
+          <w:b/>
+          <w:bCs/>
+          <w:color w:val="C00000"/>
+          <w:lang w:val="en-US"/>
+        </w:rPr>
+        <w:t>a matter of subjective impressions</w:t>
       </w:r>
     </w:p>
     <w:p>
@@ -2443,6 +2469,27 @@
           <w:lang w:val="en-US"/>
         </w:rPr>
       </w:pPr>
+      <w:r>
+        <w:rPr>
+          <w:color w:val="C00000"/>
+          <w:lang w:val="en-US"/>
+        </w:rPr>
+        <w:t xml:space="preserve">Defining naturalness is challenging, </w:t>
+      </w:r>
+      <w:r>
+        <w:rPr>
+          <w:color w:val="C00000"/>
+          <w:lang w:val="en-US"/>
+        </w:rPr>
+        <w:t>and was a key objective in</w:t>
+      </w:r>
+      <w:r>
+        <w:rPr>
+          <w:color w:val="C00000"/>
+          <w:lang w:val="en-US"/>
+        </w:rPr>
+        <w:t xml:space="preserve"> Nussbaum et al. (2025). </w:t>
+      </w:r>
       <w:sdt>
         <w:sdtPr>
           <w:rPr>
@@ -2466,7 +2513,7 @@
             <w:rPr>
               <w:lang w:val="en-US"/>
             </w:rPr>
-            <w:instrText>ADDIN CitaviPlaceholder{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}</w:instrText>
+            <w:instrText>ADDIN CitaviPlaceholder{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}</w:instrText>
           </w:r>
           <w:r>
             <w:rPr>
@@ -2517,7 +2564,7 @@
             <w:rPr>
               <w:lang w:val="en-US"/>
             </w:rPr>
-            <w:instrText>ADDIN CitaviPlaceholder{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}</w:instrText>
+            <w:instrText>ADDIN CitaviPlaceholder{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}</w:instrText>
           </w:r>
           <w:r>
             <w:rPr>
@@ -2549,13 +2596,52 @@
         <w:rPr>
           <w:lang w:val="en-US"/>
         </w:rPr>
-        <w:t xml:space="preserve">writes </w:t>
-      </w:r>
-      <w:r>
-        <w:rPr>
-          <w:lang w:val="en-US"/>
-        </w:rPr>
-        <w:t>that our dimension of “deviation-based naturalness captures how much a voice diverges from typical acoustic patterns” (</w:t>
+        <w:t>wr</w:t>
+      </w:r>
+      <w:r>
+        <w:rPr>
+          <w:lang w:val="en-US"/>
+        </w:rPr>
+        <w:t>ote</w:t>
+      </w:r>
+      <w:r>
+        <w:rPr>
+          <w:lang w:val="en-US"/>
+        </w:rPr>
+        <w:t xml:space="preserve"> </w:t>
+      </w:r>
+      <w:r>
+        <w:rPr>
+          <w:lang w:val="en-US"/>
+        </w:rPr>
+        <w:t xml:space="preserve">that our </w:t>
+      </w:r>
+      <w:r>
+        <w:rPr>
+          <w:color w:val="C00000"/>
+          <w:lang w:val="en-US"/>
+        </w:rPr>
+        <w:t xml:space="preserve">proposed </w:t>
+      </w:r>
+      <w:r>
+        <w:rPr>
+          <w:color w:val="C00000"/>
+          <w:lang w:val="en-US"/>
+        </w:rPr>
+        <w:t>d</w:t>
+      </w:r>
+      <w:r>
+        <w:rPr>
+          <w:color w:val="C00000"/>
+          <w:lang w:val="en-US"/>
+        </w:rPr>
+        <w:t>efinition</w:t>
+      </w:r>
+      <w:r>
+        <w:rPr>
+          <w:lang w:val="en-US"/>
+        </w:rPr>
+        <w:t xml:space="preserve"> of “deviation-based naturalness captures how much a voice diverges from typical acoustic patterns” (</w:t>
       </w:r>
       <w:r>
         <w:rPr>
@@ -2664,7 +2750,7 @@
             <w:rPr>
               <w:lang w:val="en-US"/>
             </w:rPr>
-            <w:instrText>ADDIN CitaviPlaceholder{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}</w:instrText>
+            <w:instrText>ADDIN CitaviPlaceholder{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}</w:instrText>
           </w:r>
           <w:r>
             <w:rPr>
@@ -2781,7 +2867,7 @@
             <w:rPr>
               <w:lang w:val="en-US"/>
             </w:rPr>
-            <w:instrText>ADDIN CitaviPlaceholder{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}</w:instrText>
+            <w:instrText>ADDIN CitaviPlaceholder{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}</w:instrText>
           </w:r>
           <w:r>
             <w:rPr>
@@ -2832,7 +2918,7 @@
             <w:rPr>
               <w:lang w:val="en-US"/>
             </w:rPr>
-            <w:instrText>ADDIN CitaviPlaceholder{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}</w:instrText>
+            <w:instrText>ADDIN CitaviPlaceholder{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}</w:instrText>
           </w:r>
           <w:r>
             <w:rPr>
@@ -2925,7 +3011,7 @@
             <w:rPr>
               <w:lang w:val="en-US"/>
             </w:rPr>
-            <w:instrText>ADDIN CitaviPlaceholder{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}</w:instrText>
+            <w:instrText>ADDIN CitaviPlaceholder{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}</w:instrText>
           </w:r>
           <w:r>
             <w:rPr>
@@ -3002,6 +3088,64 @@
           <w:color w:val="C00000"/>
           <w:lang w:val="en-US"/>
         </w:rPr>
+        <w:t xml:space="preserve"> </w:t>
+      </w:r>
+      <w:sdt>
+        <w:sdtPr>
+          <w:rPr>
+            <w:color w:val="C00000"/>
+            <w:lang w:val="en-US"/>
+          </w:rPr>
+          <w:alias w:val="To edit, see citavi.com/edit"/>
+          <w:tag w:val="CitaviPlaceholder#9287d95c-cd51-4a55-a2bc-b53c09dd3b1b"/>
+          <w:id w:val="1297795121"/>
+          <w:placeholder>
+            <w:docPart w:val="DefaultPlaceholder_-1854013440"/>
+          </w:placeholder>
+        </w:sdtPr>
+        <w:sdtContent>
+          <w:r>
+            <w:rPr>
+              <w:color w:val="C00000"/>
+              <w:lang w:val="en-US"/>
+            </w:rPr>
+            <w:fldChar w:fldCharType="begin"/>
+          </w:r>
+          <w:r>
+            <w:rPr>
+              <w:color w:val="C00000"/>
+              <w:lang w:val="en-US"/>
+            </w:rPr>
+            <w:instrText>ADDIN CitaviPlaceholder{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}</w:instrText>
+          </w:r>
+          <w:r>
+            <w:rPr>
+              <w:color w:val="C00000"/>
+              <w:lang w:val="en-US"/>
+            </w:rPr>
+            <w:fldChar w:fldCharType="separate"/>
+          </w:r>
+          <w:r>
+            <w:rPr>
+              <w:color w:val="C00000"/>
+              <w:lang w:val="en-US"/>
+            </w:rPr>
+            <w:t>(for empirical evidence, see e.g. Kapolowicz et al., 2022; Lee, 2010)</w:t>
+          </w:r>
+          <w:r>
+            <w:rPr>
+              <w:color w:val="C00000"/>
+              <w:lang w:val="en-US"/>
+            </w:rPr>
+            <w:fldChar w:fldCharType="end"/>
+          </w:r>
+        </w:sdtContent>
+      </w:sdt>
+      <w:r>
+        <w:rPr>
+          <w:color w:val="C00000"/>
+          <w:lang w:val="en-US"/>
+        </w:rPr>
         <w:t>.</w:t>
       </w:r>
       <w:r>
@@ -3009,6 +3153,34 @@
           <w:color w:val="C00000"/>
           <w:lang w:val="en-US"/>
         </w:rPr>
+        <w:t xml:space="preserve"> Any paraphrasing </w:t>
+      </w:r>
+      <w:r>
+        <w:rPr>
+          <w:color w:val="C00000"/>
+          <w:lang w:val="en-US"/>
+        </w:rPr>
+        <w:t xml:space="preserve">of </w:t>
+      </w:r>
+      <w:r>
+        <w:rPr>
+          <w:color w:val="C00000"/>
+          <w:lang w:val="en-US"/>
+        </w:rPr>
+        <w:t xml:space="preserve">voice naturalness that omits this subjective component is not only scientifically incomplete, but potentially harmful, because </w:t>
+      </w:r>
+      <w:r>
+        <w:rPr>
+          <w:color w:val="C00000"/>
+          <w:lang w:val="en-US"/>
+        </w:rPr>
+        <w:t>the</w:t>
+      </w:r>
+      <w:r>
+        <w:rPr>
+          <w:color w:val="C00000"/>
+          <w:lang w:val="en-US"/>
+        </w:rPr>
         <w:t xml:space="preserve"> </w:t>
       </w:r>
       <w:r>
@@ -3016,35 +3188,112 @@
           <w:color w:val="C00000"/>
           <w:lang w:val="en-US"/>
         </w:rPr>
-        <w:t xml:space="preserve">Any paraphrasing </w:t>
-      </w:r>
-      <w:r>
-        <w:rPr>
-          <w:color w:val="C00000"/>
-          <w:lang w:val="en-US"/>
-        </w:rPr>
-        <w:t xml:space="preserve">of </w:t>
-      </w:r>
-      <w:r>
-        <w:rPr>
-          <w:color w:val="C00000"/>
-          <w:lang w:val="en-US"/>
-        </w:rPr>
-        <w:t>voice naturalness that</w:t>
-      </w:r>
-      <w:r>
-        <w:rPr>
-          <w:color w:val="C00000"/>
-          <w:lang w:val="en-US"/>
-        </w:rPr>
-        <w:t xml:space="preserve"> omits this subjective component is not only scientifically incomplete, but potentially harmful, because </w:t>
-      </w:r>
-      <w:r>
-        <w:rPr>
-          <w:color w:val="C00000"/>
-          <w:lang w:val="en-US"/>
-        </w:rPr>
-        <w:t>the</w:t>
+        <w:t xml:space="preserve">implication – even if unintentional - </w:t>
+      </w:r>
+      <w:r>
+        <w:rPr>
+          <w:color w:val="C00000"/>
+          <w:lang w:val="en-US"/>
+        </w:rPr>
+        <w:t>that</w:t>
+      </w:r>
+      <w:r>
+        <w:rPr>
+          <w:color w:val="C00000"/>
+          <w:lang w:val="en-US"/>
+        </w:rPr>
+        <w:t xml:space="preserve"> there is an objective ground truth of </w:t>
+      </w:r>
+      <w:r>
+        <w:rPr>
+          <w:color w:val="C00000"/>
+          <w:lang w:val="en-US"/>
+        </w:rPr>
+        <w:t xml:space="preserve">what constitutes </w:t>
+      </w:r>
+      <w:r>
+        <w:rPr>
+          <w:color w:val="C00000"/>
+          <w:lang w:val="en-US"/>
+        </w:rPr>
+        <w:t>naturalness in</w:t>
+      </w:r>
+      <w:r>
+        <w:rPr>
+          <w:color w:val="C00000"/>
+          <w:lang w:val="en-US"/>
+        </w:rPr>
+        <w:t xml:space="preserve"> voices gives rise to discrimination </w:t>
+      </w:r>
+      <w:r>
+        <w:rPr>
+          <w:color w:val="C00000"/>
+          <w:lang w:val="en-US"/>
+        </w:rPr>
+        <w:t>and repression of vocal diversity.</w:t>
+      </w:r>
+      <w:r>
+        <w:rPr>
+          <w:color w:val="C00000"/>
+          <w:lang w:val="en-US"/>
+        </w:rPr>
+        <w:t xml:space="preserve"> Vocal minorities, who locate themselves outside of the distribution of </w:t>
+      </w:r>
+      <w:r>
+        <w:rPr>
+          <w:color w:val="C00000"/>
+          <w:lang w:val="en-US"/>
+        </w:rPr>
+        <w:t>“</w:t>
+      </w:r>
+      <w:r>
+        <w:rPr>
+          <w:color w:val="C00000"/>
+          <w:lang w:val="en-US"/>
+        </w:rPr>
+        <w:t>typical</w:t>
+      </w:r>
+      <w:r>
+        <w:rPr>
+          <w:color w:val="C00000"/>
+          <w:lang w:val="en-US"/>
+        </w:rPr>
+        <w:t>”</w:t>
+      </w:r>
+      <w:r>
+        <w:rPr>
+          <w:color w:val="C00000"/>
+          <w:lang w:val="en-US"/>
+        </w:rPr>
+        <w:t xml:space="preserve"> acoustic patterns, </w:t>
+      </w:r>
+      <w:r>
+        <w:rPr>
+          <w:color w:val="C00000"/>
+          <w:lang w:val="en-US"/>
+        </w:rPr>
+        <w:t xml:space="preserve">would be labelled as unnatural, although they may </w:t>
+      </w:r>
+      <w:r>
+        <w:rPr>
+          <w:color w:val="C00000"/>
+          <w:lang w:val="en-US"/>
+        </w:rPr>
+        <w:t xml:space="preserve">simply express their </w:t>
+      </w:r>
+      <w:r>
+        <w:rPr>
+          <w:color w:val="C00000"/>
+          <w:lang w:val="en-US"/>
+        </w:rPr>
+        <w:t xml:space="preserve">natural </w:t>
+      </w:r>
+      <w:r>
+        <w:rPr>
+          <w:color w:val="C00000"/>
+          <w:lang w:val="en-US"/>
+        </w:rPr>
+        <w:t>individuality.</w:t>
       </w:r>
       <w:r>
         <w:rPr>
@@ -3058,126 +3307,106 @@
           <w:color w:val="C00000"/>
           <w:lang w:val="en-US"/>
         </w:rPr>
-        <w:t xml:space="preserve">implication – even if unintentional - </w:t>
-      </w:r>
-      <w:r>
-        <w:rPr>
-          <w:color w:val="C00000"/>
-          <w:lang w:val="en-US"/>
-        </w:rPr>
-        <w:t>that</w:t>
-      </w:r>
-      <w:r>
-        <w:rPr>
-          <w:color w:val="C00000"/>
-          <w:lang w:val="en-US"/>
-        </w:rPr>
-        <w:t xml:space="preserve"> there is an objective ground truth of </w:t>
-      </w:r>
-      <w:r>
-        <w:rPr>
-          <w:color w:val="C00000"/>
-          <w:lang w:val="en-US"/>
-        </w:rPr>
-        <w:t xml:space="preserve">what constitutes as </w:t>
-      </w:r>
-      <w:r>
-        <w:rPr>
-          <w:color w:val="C00000"/>
-          <w:lang w:val="en-US"/>
-        </w:rPr>
-        <w:t xml:space="preserve">natural in voices gives rise to discrimination </w:t>
-      </w:r>
-      <w:r>
-        <w:rPr>
-          <w:color w:val="C00000"/>
-          <w:lang w:val="en-US"/>
-        </w:rPr>
-        <w:t>and repression of vocal diversity.</w:t>
-      </w:r>
-      <w:r>
-        <w:rPr>
-          <w:color w:val="C00000"/>
-          <w:lang w:val="en-US"/>
-        </w:rPr>
-        <w:t xml:space="preserve"> To counteract such potential harm, we </w:t>
-      </w:r>
-      <w:r>
-        <w:rPr>
-          <w:color w:val="C00000"/>
-          <w:lang w:val="en-US"/>
-        </w:rPr>
-        <w:t>share the responsibility in making an</w:t>
-      </w:r>
-      <w:r>
-        <w:rPr>
-          <w:color w:val="C00000"/>
-          <w:lang w:val="en-US"/>
-        </w:rPr>
-        <w:t xml:space="preserve"> active effort </w:t>
-      </w:r>
-      <w:r>
-        <w:rPr>
-          <w:color w:val="C00000"/>
-          <w:lang w:val="en-US"/>
-        </w:rPr>
-        <w:t>though</w:t>
-      </w:r>
-      <w:r>
-        <w:rPr>
-          <w:color w:val="C00000"/>
-          <w:lang w:val="en-US"/>
-        </w:rPr>
-        <w:t xml:space="preserve"> </w:t>
-      </w:r>
-      <w:r>
-        <w:rPr>
-          <w:color w:val="C00000"/>
-          <w:lang w:val="en-US"/>
-        </w:rPr>
-        <w:t xml:space="preserve">our </w:t>
-      </w:r>
-      <w:r>
-        <w:rPr>
-          <w:color w:val="C00000"/>
-          <w:lang w:val="en-US"/>
-        </w:rPr>
-        <w:t xml:space="preserve">scientific </w:t>
-      </w:r>
-      <w:r>
-        <w:rPr>
-          <w:color w:val="C00000"/>
-          <w:lang w:val="en-US"/>
-        </w:rPr>
-        <w:t xml:space="preserve">debates and constantly </w:t>
-      </w:r>
-      <w:r>
-        <w:rPr>
-          <w:color w:val="C00000"/>
-          <w:lang w:val="en-US"/>
-        </w:rPr>
-        <w:t>reflect on the</w:t>
-      </w:r>
-      <w:r>
-        <w:rPr>
-          <w:color w:val="C00000"/>
-          <w:lang w:val="en-US"/>
-        </w:rPr>
-        <w:t xml:space="preserve"> choice of</w:t>
-      </w:r>
-      <w:r>
-        <w:rPr>
-          <w:color w:val="C00000"/>
-          <w:lang w:val="en-US"/>
-        </w:rPr>
-        <w:t xml:space="preserve"> wording and</w:t>
-      </w:r>
-      <w:r>
-        <w:rPr>
-          <w:color w:val="C00000"/>
-          <w:lang w:val="en-US"/>
-        </w:rPr>
-        <w:t xml:space="preserve"> potential misunderstandings that could arise from it. On the conceptual understanding beneath, we are fully aligned with</w:t>
+        <w:t xml:space="preserve">To counteract such potential harm, we share the responsibility in making an active effort though our scientific debates </w:t>
+      </w:r>
+      <w:r>
+        <w:rPr>
+          <w:color w:val="C00000"/>
+          <w:lang w:val="en-US"/>
+        </w:rPr>
+        <w:t>by</w:t>
+      </w:r>
+      <w:r>
+        <w:rPr>
+          <w:color w:val="C00000"/>
+          <w:lang w:val="en-US"/>
+        </w:rPr>
+        <w:t xml:space="preserve"> reflect</w:t>
+      </w:r>
+      <w:r>
+        <w:rPr>
+          <w:color w:val="C00000"/>
+          <w:lang w:val="en-US"/>
+        </w:rPr>
+        <w:t>ing</w:t>
+      </w:r>
+      <w:r>
+        <w:rPr>
+          <w:color w:val="C00000"/>
+          <w:lang w:val="en-US"/>
+        </w:rPr>
+        <w:t xml:space="preserve"> on the choice of wording and potential misunderstandings that could arise from it.</w:t>
+      </w:r>
+      <w:r>
+        <w:rPr>
+          <w:color w:val="C00000"/>
+          <w:lang w:val="en-US"/>
+        </w:rPr>
+        <w:t xml:space="preserve"> Note that for </w:t>
+      </w:r>
+      <w:r>
+        <w:rPr>
+          <w:color w:val="C00000"/>
+          <w:lang w:val="en-US"/>
+        </w:rPr>
+        <w:t>the same</w:t>
+      </w:r>
+      <w:r>
+        <w:rPr>
+          <w:color w:val="C00000"/>
+          <w:lang w:val="en-US"/>
+        </w:rPr>
+        <w:t xml:space="preserve"> reason, we also recommend caution with words like “appropriateness” as a </w:t>
+      </w:r>
+      <w:r>
+        <w:rPr>
+          <w:color w:val="C00000"/>
+          <w:lang w:val="en-US"/>
+        </w:rPr>
+        <w:t>reconceptualiz</w:t>
+      </w:r>
+      <w:r>
+        <w:rPr>
+          <w:color w:val="C00000"/>
+          <w:lang w:val="en-US"/>
+        </w:rPr>
+        <w:t>ation of</w:t>
+      </w:r>
+      <w:r>
+        <w:rPr>
+          <w:color w:val="C00000"/>
+          <w:lang w:val="en-US"/>
+        </w:rPr>
+        <w:t xml:space="preserve"> naturalness</w:t>
+      </w:r>
+      <w:r>
+        <w:rPr>
+          <w:color w:val="C00000"/>
+          <w:lang w:val="en-US"/>
+        </w:rPr>
+        <w:t xml:space="preserve"> (Pinheiro, 2025, p. 4046), which may carry an additional evaluative layer which could be perceived as hurtful by the </w:t>
+      </w:r>
+      <w:r>
+        <w:rPr>
+          <w:color w:val="C00000"/>
+          <w:lang w:val="en-US"/>
+        </w:rPr>
+        <w:lastRenderedPageBreak/>
+        <w:t xml:space="preserve">affected individuals, despite best intentions. </w:t>
+      </w:r>
+      <w:r>
+        <w:rPr>
+          <w:color w:val="C00000"/>
+          <w:lang w:val="en-US"/>
+        </w:rPr>
+        <w:t>On the conceptual understanding beneath,</w:t>
+      </w:r>
+      <w:r>
+        <w:rPr>
+          <w:color w:val="C00000"/>
+          <w:lang w:val="en-US"/>
+        </w:rPr>
+        <w:t xml:space="preserve"> however,</w:t>
       </w:r>
       <w:r>
         <w:rPr>
@@ -3209,7 +3438,7 @@
             <w:rPr>
               <w:lang w:val="en-US"/>
             </w:rPr>
-            <w:instrText>ADDIN CitaviPlaceholder{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}</w:instrText>
+            <w:instrText>ADDIN CitaviPlaceholder{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}</w:instrText>
           </w:r>
           <w:r>
             <w:rPr>
@@ -3260,7 +3489,7 @@
             <w:rPr>
               <w:lang w:val="en-US"/>
             </w:rPr>
-            <w:instrText>ADDIN CitaviPlaceholder{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}</w:instrText>
+            <w:instrText>ADDIN CitaviPlaceholder{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}</w:instrText>
           </w:r>
           <w:r>
             <w:rPr>
@@ -3286,13 +3515,13 @@
         <w:rPr>
           <w:lang w:val="en-US"/>
         </w:rPr>
-        <w:t>, who</w:t>
-      </w:r>
-      <w:r>
-        <w:rPr>
-          <w:lang w:val="en-US"/>
-        </w:rPr>
-        <w:t xml:space="preserve"> sums </w:t>
+        <w:t xml:space="preserve"> </w:t>
+      </w:r>
+      <w:r>
+        <w:rPr>
+          <w:lang w:val="en-US"/>
+        </w:rPr>
+        <w:t xml:space="preserve">sums </w:t>
       </w:r>
       <w:r>
         <w:rPr>
@@ -3310,7 +3539,33 @@
         <w:rPr>
           <w:lang w:val="en-US"/>
         </w:rPr>
-        <w:t xml:space="preserve">This is - </w:t>
+        <w:t>W</w:t>
+      </w:r>
+      <w:r>
+        <w:rPr>
+          <w:color w:val="C00000"/>
+          <w:lang w:val="en-US"/>
+        </w:rPr>
+        <w:t>e are fully aligned with</w:t>
+      </w:r>
+      <w:r>
+        <w:rPr>
+          <w:color w:val="C00000"/>
+          <w:lang w:val="en-US"/>
+        </w:rPr>
+        <w:t xml:space="preserve"> </w:t>
+      </w:r>
+      <w:r>
+        <w:rPr>
+          <w:lang w:val="en-US"/>
+        </w:rPr>
+        <w:t>this -</w:t>
+      </w:r>
+      <w:r>
+        <w:rPr>
+          <w:lang w:val="en-US"/>
+        </w:rPr>
+        <w:t xml:space="preserve"> </w:t>
       </w:r>
       <w:r>
         <w:rPr>
@@ -3322,13 +3577,31 @@
         <w:rPr>
           <w:lang w:val="en-US"/>
         </w:rPr>
-        <w:t xml:space="preserve"> -</w:t>
-      </w:r>
-      <w:r>
-        <w:rPr>
-          <w:lang w:val="en-US"/>
-        </w:rPr>
-        <w:t xml:space="preserve"> the essence of our model (cf. Figure 2, </w:t>
+        <w:t>, it is</w:t>
+      </w:r>
+      <w:r>
+        <w:rPr>
+          <w:lang w:val="en-US"/>
+        </w:rPr>
+        <w:t xml:space="preserve"> </w:t>
+      </w:r>
+      <w:r>
+        <w:rPr>
+          <w:lang w:val="en-US"/>
+        </w:rPr>
+        <w:t>the</w:t>
+      </w:r>
+      <w:r>
+        <w:rPr>
+          <w:lang w:val="en-US"/>
+        </w:rPr>
+        <w:t xml:space="preserve"> </w:t>
+      </w:r>
+      <w:r>
+        <w:rPr>
+          <w:lang w:val="en-US"/>
+        </w:rPr>
+        <w:t xml:space="preserve">essence of our model (cf. Figure 2, </w:t>
       </w:r>
       <w:sdt>
         <w:sdtPr>
@@ -3353,7 +3626,7 @@
             <w:rPr>
               <w:lang w:val="en-US"/>
             </w:rPr>
-            <w:instrText>ADDIN CitaviPlaceholder{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}</w:instrText>
+            <w:instrText>ADDIN CitaviPlaceholder{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}</w:instrText>
           </w:r>
           <w:r>
             <w:rPr>
@@ -3404,7 +3677,7 @@
             <w:rPr>
               <w:lang w:val="en-US"/>
             </w:rPr>
-            <w:instrText>ADDIN CitaviPlaceholder{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}</w:instrText>
+            <w:instrText>ADDIN CitaviPlaceholder{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}</w:instrText>
           </w:r>
           <w:r>
             <w:rPr>
@@ -3437,683 +3710,94 @@
           <w:lang w:val="en-US"/>
         </w:rPr>
         <w:t xml:space="preserve"> page 473).</w:t>
+      </w:r>
+      <w:r>
+        <w:rPr>
+          <w:color w:val="C00000"/>
+          <w:lang w:val="en-US"/>
+        </w:rPr>
+        <w:t xml:space="preserve"> </w:t>
+      </w:r>
+      <w:commentRangeStart w:id="2"/>
+      <w:r>
+        <w:rPr>
+          <w:color w:val="C00000"/>
+          <w:lang w:val="en-US"/>
+        </w:rPr>
+        <w:t>W</w:t>
+      </w:r>
+      <w:r>
+        <w:rPr>
+          <w:color w:val="C00000"/>
+          <w:lang w:val="en-US"/>
+        </w:rPr>
+        <w:t>e</w:t>
+      </w:r>
+      <w:commentRangeEnd w:id="2"/>
+      <w:r>
+        <w:rPr>
+          <w:rStyle w:val="Kommentarzeichen"/>
+          <w:color w:val="C00000"/>
+          <w:sz w:val="22"/>
+          <w:szCs w:val="22"/>
+          <w:lang w:val="en-US"/>
+        </w:rPr>
+        <w:commentReference w:id="2"/>
+      </w:r>
+      <w:r>
+        <w:rPr>
+          <w:color w:val="C00000"/>
+          <w:lang w:val="en-US"/>
+        </w:rPr>
+        <w:t xml:space="preserve"> </w:t>
+      </w:r>
+      <w:r>
+        <w:rPr>
+          <w:color w:val="C00000"/>
+          <w:lang w:val="en-US"/>
+        </w:rPr>
+        <w:t xml:space="preserve">maintain that a full </w:t>
+      </w:r>
+      <w:r>
+        <w:rPr>
+          <w:color w:val="C00000"/>
+          <w:lang w:val="en-US"/>
+        </w:rPr>
+        <w:t xml:space="preserve">understanding of voice naturalness </w:t>
+      </w:r>
+      <w:r>
+        <w:rPr>
+          <w:color w:val="C00000"/>
+          <w:lang w:val="en-US"/>
+        </w:rPr>
+        <w:t>requires more systematic research that assesses</w:t>
+      </w:r>
+      <w:r>
+        <w:rPr>
+          <w:color w:val="C00000"/>
+          <w:lang w:val="en-US"/>
+        </w:rPr>
+        <w:t xml:space="preserve"> differences across listeners and contexts, </w:t>
+      </w:r>
+      <w:r>
+        <w:rPr>
+          <w:color w:val="C00000"/>
+          <w:lang w:val="en-US"/>
+        </w:rPr>
+        <w:t>addressing societal aspects of speech production as well</w:t>
+      </w:r>
+      <w:r>
+        <w:rPr>
+          <w:color w:val="C00000"/>
+          <w:lang w:val="en-US"/>
+        </w:rPr>
+        <w:t xml:space="preserve">. </w:t>
       </w:r>
     </w:p>
     <w:p>
       <w:pPr>
         <w:spacing w:line="480" w:lineRule="auto"/>
         <w:rPr>
-          <w:lang w:val="en-US"/>
-        </w:rPr>
-      </w:pPr>
-      <w:r>
-        <w:rPr>
-          <w:lang w:val="en-US"/>
-        </w:rPr>
-        <w:t xml:space="preserve"> </w:t>
-      </w:r>
-    </w:p>
-    <w:p>
-      <w:pPr>
-        <w:spacing w:line="480" w:lineRule="auto"/>
-        <w:rPr>
-          <w:color w:val="C00000"/>
-          <w:lang w:val="en-US"/>
-        </w:rPr>
-      </w:pPr>
-      <w:r>
-        <w:rPr>
-          <w:color w:val="C00000"/>
-          <w:lang w:val="en-US"/>
-        </w:rPr>
-        <w:lastRenderedPageBreak/>
-        <w:t>The listener- and context-dependent nature of voice naturalness impressions is already somewhat reflected in the empirical literature</w:t>
-      </w:r>
-      <w:r>
-        <w:rPr>
-          <w:lang w:val="en-US"/>
-        </w:rPr>
-        <w:t xml:space="preserve">: </w:t>
-      </w:r>
-      <w:r>
-        <w:rPr>
-          <w:lang w:val="en-US"/>
-        </w:rPr>
-        <w:t xml:space="preserve">For example, </w:t>
-      </w:r>
-      <w:r>
-        <w:rPr>
-          <w:lang w:val="en-US"/>
-        </w:rPr>
-        <w:t xml:space="preserve">listeners judge speech </w:t>
-      </w:r>
-      <w:r>
-        <w:rPr>
-          <w:lang w:val="en-US"/>
-        </w:rPr>
-        <w:t xml:space="preserve">in </w:t>
-      </w:r>
-      <w:r>
-        <w:rPr>
-          <w:lang w:val="en-US"/>
-        </w:rPr>
-        <w:t xml:space="preserve">their own accent </w:t>
-      </w:r>
-      <w:r>
-        <w:rPr>
-          <w:lang w:val="en-US"/>
-        </w:rPr>
-        <w:t xml:space="preserve">as </w:t>
-      </w:r>
-      <w:r>
-        <w:rPr>
-          <w:lang w:val="en-US"/>
-        </w:rPr>
-        <w:t>more natural than foreign-accented speech</w:t>
-      </w:r>
-      <w:r>
-        <w:rPr>
-          <w:lang w:val="en-US"/>
-        </w:rPr>
-        <w:t xml:space="preserve"> </w:t>
-      </w:r>
-      <w:sdt>
-        <w:sdtPr>
-          <w:rPr>
-            <w:lang w:val="en-US"/>
-          </w:rPr>
-          <w:alias w:val="To edit, see citavi.com/edit"/>
-          <w:tag w:val="CitaviPlaceholder#63c3a878-f7c0-4393-8512-6696cd35f635"/>
-          <w:id w:val="357933481"/>
-          <w:placeholder>
-            <w:docPart w:val="DefaultPlaceholder_-1854013440"/>
-          </w:placeholder>
-        </w:sdtPr>
-        <w:sdtContent>
-          <w:r>
-            <w:rPr>
-              <w:lang w:val="en-US"/>
-            </w:rPr>
-            <w:fldChar w:fldCharType="begin"/>
-          </w:r>
-          <w:r>
-            <w:rPr>
-              <w:lang w:val="en-US"/>
-            </w:rPr>
-            <w:instrText>ADDIN CitaviPlaceholder{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}</w:instrText>
-          </w:r>
-          <w:r>
-            <w:rPr>
-              <w:lang w:val="en-US"/>
-            </w:rPr>
-            <w:fldChar w:fldCharType="separate"/>
-          </w:r>
-          <w:r>
-            <w:rPr>
-              <w:lang w:val="en-US"/>
-            </w:rPr>
-            <w:t>(Kapolowicz et al., 2022)</w:t>
-          </w:r>
-          <w:r>
-            <w:rPr>
-              <w:lang w:val="en-US"/>
-            </w:rPr>
-            <w:fldChar w:fldCharType="end"/>
-          </w:r>
-        </w:sdtContent>
-      </w:sdt>
-      <w:r>
-        <w:rPr>
-          <w:lang w:val="en-US"/>
-        </w:rPr>
-        <w:t xml:space="preserve">. </w:t>
-      </w:r>
-      <w:r>
-        <w:rPr>
-          <w:lang w:val="en-US"/>
-        </w:rPr>
-        <w:t>T</w:t>
-      </w:r>
-      <w:r>
-        <w:rPr>
-          <w:lang w:val="en-US"/>
-        </w:rPr>
-        <w:t xml:space="preserve">he perception and acceptance of synthetic voices </w:t>
-      </w:r>
-      <w:r>
-        <w:rPr>
-          <w:lang w:val="en-US"/>
-        </w:rPr>
-        <w:t xml:space="preserve">also seems </w:t>
-      </w:r>
-      <w:r>
-        <w:rPr>
-          <w:lang w:val="en-US"/>
-        </w:rPr>
-        <w:t xml:space="preserve">modulated by </w:t>
-      </w:r>
-      <w:r>
-        <w:rPr>
-          <w:lang w:val="en-US"/>
-        </w:rPr>
-        <w:t>listeners’</w:t>
-      </w:r>
-      <w:r>
-        <w:rPr>
-          <w:lang w:val="en-US"/>
-        </w:rPr>
-        <w:t xml:space="preserve"> </w:t>
-      </w:r>
-      <w:r>
-        <w:rPr>
-          <w:lang w:val="en-US"/>
-        </w:rPr>
-        <w:t>personalities</w:t>
-      </w:r>
-      <w:r>
-        <w:rPr>
-          <w:lang w:val="en-US"/>
-        </w:rPr>
-        <w:t xml:space="preserve"> </w:t>
-      </w:r>
-      <w:sdt>
-        <w:sdtPr>
-          <w:rPr>
-            <w:lang w:val="en-US"/>
-          </w:rPr>
-          <w:alias w:val="To edit, see citavi.com/edit"/>
-          <w:tag w:val="CitaviPlaceholder#b7f3c6d7-04ac-41e2-885e-5d27564d5108"/>
-          <w:id w:val="-189766194"/>
-          <w:placeholder>
-            <w:docPart w:val="DefaultPlaceholder_-1854013440"/>
-          </w:placeholder>
-        </w:sdtPr>
-        <w:sdtContent>
-          <w:r>
-            <w:rPr>
-              <w:lang w:val="en-US"/>
-            </w:rPr>
-            <w:fldChar w:fldCharType="begin"/>
-          </w:r>
-          <w:r>
-            <w:rPr>
-              <w:lang w:val="en-US"/>
-            </w:rPr>
-            <w:instrText>ADDIN CitaviPlaceholder{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}</w:instrText>
-          </w:r>
-          <w:r>
-            <w:rPr>
-              <w:lang w:val="en-US"/>
-            </w:rPr>
-            <w:fldChar w:fldCharType="separate"/>
-          </w:r>
-          <w:r>
-            <w:rPr>
-              <w:lang w:val="en-US"/>
-            </w:rPr>
-            <w:t>(Lee, 2010)</w:t>
-          </w:r>
-          <w:r>
-            <w:rPr>
-              <w:lang w:val="en-US"/>
-            </w:rPr>
-            <w:fldChar w:fldCharType="end"/>
-          </w:r>
-        </w:sdtContent>
-      </w:sdt>
-      <w:r>
-        <w:rPr>
-          <w:lang w:val="en-US"/>
-        </w:rPr>
-        <w:t xml:space="preserve"> and </w:t>
-      </w:r>
-      <w:r>
-        <w:rPr>
-          <w:lang w:val="en-US"/>
-        </w:rPr>
-        <w:t>multimodal context</w:t>
-      </w:r>
-      <w:r>
-        <w:rPr>
-          <w:lang w:val="en-US"/>
-        </w:rPr>
-        <w:t>,</w:t>
-      </w:r>
-      <w:r>
-        <w:rPr>
-          <w:lang w:val="en-US"/>
-        </w:rPr>
-        <w:t xml:space="preserve"> such as the </w:t>
-      </w:r>
-      <w:r>
-        <w:rPr>
-          <w:lang w:val="en-US"/>
-        </w:rPr>
-        <w:t>visual</w:t>
-      </w:r>
-      <w:r>
-        <w:rPr>
-          <w:lang w:val="en-US"/>
-        </w:rPr>
-        <w:t xml:space="preserve"> appearance of an artificial agent </w:t>
-      </w:r>
-      <w:sdt>
-        <w:sdtPr>
-          <w:rPr>
-            <w:lang w:val="en-US"/>
-          </w:rPr>
-          <w:alias w:val="To edit, see citavi.com/edit"/>
-          <w:tag w:val="CitaviPlaceholder#b2323036-11de-476b-ba36-e73548882468"/>
-          <w:id w:val="-490176726"/>
-          <w:placeholder>
-            <w:docPart w:val="DefaultPlaceholder_-1854013440"/>
-          </w:placeholder>
-        </w:sdtPr>
-        <w:sdtContent>
-          <w:r>
-            <w:rPr>
-              <w:lang w:val="en-US"/>
-            </w:rPr>
-            <w:fldChar w:fldCharType="begin"/>
-          </w:r>
-          <w:r>
-            <w:rPr>
-              <w:lang w:val="en-US"/>
-            </w:rPr>
-            <w:instrText>ADDIN CitaviPlaceholder{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}</w:instrText>
-          </w:r>
-          <w:r>
-            <w:rPr>
-              <w:lang w:val="en-US"/>
-            </w:rPr>
-            <w:fldChar w:fldCharType="separate"/>
-          </w:r>
-          <w:r>
-            <w:rPr>
-              <w:lang w:val="en-US"/>
-            </w:rPr>
-            <w:t>(Mitchell et al., 2011)</w:t>
-          </w:r>
-          <w:r>
-            <w:rPr>
-              <w:lang w:val="en-US"/>
-            </w:rPr>
-            <w:fldChar w:fldCharType="end"/>
-          </w:r>
-        </w:sdtContent>
-      </w:sdt>
-      <w:r>
-        <w:rPr>
-          <w:lang w:val="en-US"/>
-        </w:rPr>
-        <w:t>.</w:t>
-      </w:r>
-      <w:r>
-        <w:rPr>
-          <w:lang w:val="en-US"/>
-        </w:rPr>
-        <w:t xml:space="preserve"> </w:t>
-      </w:r>
-      <w:r>
-        <w:rPr>
-          <w:lang w:val="en-US"/>
-        </w:rPr>
-        <w:t>Moreover</w:t>
-      </w:r>
-      <w:r>
-        <w:rPr>
-          <w:lang w:val="en-US"/>
-        </w:rPr>
-        <w:t xml:space="preserve">, auditory adaptation aftereffects in the perception of acoustically identical voices </w:t>
-      </w:r>
-      <w:sdt>
-        <w:sdtPr>
-          <w:rPr>
-            <w:lang w:val="en-US"/>
-          </w:rPr>
-          <w:alias w:val="To edit, see citavi.com/edit"/>
-          <w:tag w:val="CitaviPlaceholder#defedbb7-7406-491e-a597-8dd734286469"/>
-          <w:id w:val="-1507591955"/>
-          <w:placeholder>
-            <w:docPart w:val="DefaultPlaceholder_-1854013440"/>
-          </w:placeholder>
-        </w:sdtPr>
-        <w:sdtContent>
-          <w:r>
-            <w:rPr>
-              <w:lang w:val="en-US"/>
-            </w:rPr>
-            <w:fldChar w:fldCharType="begin"/>
-          </w:r>
-          <w:r>
-            <w:rPr>
-              <w:lang w:val="en-US"/>
-            </w:rPr>
-            <w:instrText>ADDIN CitaviPlaceholder{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}</w:instrText>
-          </w:r>
-          <w:r>
-            <w:rPr>
-              <w:lang w:val="en-US"/>
-            </w:rPr>
-            <w:fldChar w:fldCharType="separate"/>
-          </w:r>
-          <w:r>
-            <w:rPr>
-              <w:lang w:val="en-US"/>
-            </w:rPr>
-            <w:t>(Schweinberger et al., 2008)</w:t>
-          </w:r>
-          <w:r>
-            <w:rPr>
-              <w:lang w:val="en-US"/>
-            </w:rPr>
-            <w:fldChar w:fldCharType="end"/>
-          </w:r>
-        </w:sdtContent>
-      </w:sdt>
-      <w:r>
-        <w:rPr>
-          <w:lang w:val="en-US"/>
-        </w:rPr>
-        <w:t xml:space="preserve"> have now been established as a ubiquitous phenomenon.</w:t>
-      </w:r>
-      <w:r>
-        <w:rPr>
-          <w:lang w:val="en-US"/>
-        </w:rPr>
-        <w:t xml:space="preserve"> </w:t>
-      </w:r>
-      <w:r>
-        <w:rPr>
-          <w:lang w:val="en-US"/>
-        </w:rPr>
-        <w:t xml:space="preserve">However, </w:t>
-      </w:r>
-      <w:r>
-        <w:rPr>
-          <w:lang w:val="en-US"/>
-        </w:rPr>
-        <w:t xml:space="preserve">as outlined in the </w:t>
-      </w:r>
-      <w:r>
-        <w:rPr>
-          <w:i/>
-          <w:iCs/>
-          <w:lang w:val="en-US"/>
-        </w:rPr>
-        <w:t>outstanding questions</w:t>
-      </w:r>
-      <w:r>
-        <w:rPr>
-          <w:lang w:val="en-US"/>
-        </w:rPr>
-        <w:t xml:space="preserve"> section</w:t>
-      </w:r>
-      <w:r>
-        <w:rPr>
-          <w:lang w:val="en-US"/>
-        </w:rPr>
-        <w:t xml:space="preserve"> in </w:t>
-      </w:r>
-      <w:sdt>
-        <w:sdtPr>
-          <w:rPr>
-            <w:lang w:val="en-US"/>
-          </w:rPr>
-          <w:alias w:val="To edit, see citavi.com/edit"/>
-          <w:tag w:val="CitaviPlaceholder#bcdae68c-f767-4cda-ab43-6471e6fd763b"/>
-          <w:id w:val="493307413"/>
-          <w:placeholder>
-            <w:docPart w:val="DefaultPlaceholder_-1854013440"/>
-          </w:placeholder>
-        </w:sdtPr>
-        <w:sdtContent>
-          <w:r>
-            <w:rPr>
-              <w:lang w:val="en-US"/>
-            </w:rPr>
-            <w:fldChar w:fldCharType="begin"/>
-          </w:r>
-          <w:r>
-            <w:rPr>
-              <w:lang w:val="en-US"/>
-            </w:rPr>
-            <w:instrText>ADDIN CitaviPlaceholder{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}</w:instrText>
-          </w:r>
-          <w:r>
-            <w:rPr>
-              <w:lang w:val="en-US"/>
-            </w:rPr>
-            <w:fldChar w:fldCharType="separate"/>
-          </w:r>
-          <w:r>
-            <w:rPr>
-              <w:lang w:val="en-US"/>
-            </w:rPr>
-            <w:t>Nussbaum et al.</w:t>
-          </w:r>
-          <w:r>
-            <w:rPr>
-              <w:lang w:val="en-US"/>
-            </w:rPr>
-            <w:fldChar w:fldCharType="end"/>
-          </w:r>
-        </w:sdtContent>
-      </w:sdt>
-      <w:r>
-        <w:rPr>
-          <w:lang w:val="en-US"/>
-        </w:rPr>
-        <w:t xml:space="preserve"> </w:t>
-      </w:r>
-      <w:sdt>
-        <w:sdtPr>
-          <w:rPr>
-            <w:lang w:val="en-US"/>
-          </w:rPr>
-          <w:alias w:val="To edit, see citavi.com/edit"/>
-          <w:tag w:val="CitaviPlaceholder#4ed4e402-7065-46a9-9f1d-262efd61a533"/>
-          <w:id w:val="907427160"/>
-          <w:placeholder>
-            <w:docPart w:val="DefaultPlaceholder_-1854013440"/>
-          </w:placeholder>
-        </w:sdtPr>
-        <w:sdtContent>
-          <w:r>
-            <w:rPr>
-              <w:lang w:val="en-US"/>
-            </w:rPr>
-            <w:fldChar w:fldCharType="begin"/>
-          </w:r>
-          <w:r>
-            <w:rPr>
-              <w:lang w:val="en-US"/>
-            </w:rPr>
-            <w:instrText>ADDIN CitaviPlaceholder{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}</w:instrText>
-          </w:r>
-          <w:r>
-            <w:rPr>
-              <w:lang w:val="en-US"/>
-            </w:rPr>
-            <w:fldChar w:fldCharType="separate"/>
-          </w:r>
-          <w:r>
-            <w:rPr>
-              <w:lang w:val="en-US"/>
-            </w:rPr>
-            <w:t>(2025)</w:t>
-          </w:r>
-          <w:r>
-            <w:rPr>
-              <w:lang w:val="en-US"/>
-            </w:rPr>
-            <w:fldChar w:fldCharType="end"/>
-          </w:r>
-        </w:sdtContent>
-      </w:sdt>
-      <w:r>
-        <w:rPr>
-          <w:lang w:val="en-US"/>
-        </w:rPr>
-        <w:t xml:space="preserve"> and in agreement with </w:t>
-      </w:r>
-      <w:sdt>
-        <w:sdtPr>
-          <w:rPr>
-            <w:lang w:val="en-US"/>
-          </w:rPr>
-          <w:alias w:val="To edit, see citavi.com/edit"/>
-          <w:tag w:val="CitaviPlaceholder#a6df8f4b-0ca3-4f5e-a91e-8ed8a5d08b18"/>
-          <w:id w:val="-701011216"/>
-          <w:placeholder>
-            <w:docPart w:val="DefaultPlaceholder_-1854013440"/>
-          </w:placeholder>
-        </w:sdtPr>
-        <w:sdtContent>
-          <w:r>
-            <w:rPr>
-              <w:lang w:val="en-US"/>
-            </w:rPr>
-            <w:fldChar w:fldCharType="begin"/>
-          </w:r>
-          <w:r>
-            <w:rPr>
-              <w:lang w:val="en-US"/>
-            </w:rPr>
-            <w:instrText>ADDIN CitaviPlaceholder{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}</w:instrText>
-          </w:r>
-          <w:r>
-            <w:rPr>
-              <w:lang w:val="en-US"/>
-            </w:rPr>
-            <w:fldChar w:fldCharType="separate"/>
-          </w:r>
-          <w:r>
-            <w:rPr>
-              <w:lang w:val="en-US"/>
-            </w:rPr>
-            <w:t>Pinheiro</w:t>
-          </w:r>
-          <w:r>
-            <w:rPr>
-              <w:lang w:val="en-US"/>
-            </w:rPr>
-            <w:fldChar w:fldCharType="end"/>
-          </w:r>
-        </w:sdtContent>
-      </w:sdt>
-      <w:r>
-        <w:rPr>
-          <w:lang w:val="en-US"/>
-        </w:rPr>
-        <w:t xml:space="preserve"> </w:t>
-      </w:r>
-      <w:sdt>
-        <w:sdtPr>
-          <w:rPr>
-            <w:lang w:val="en-US"/>
-          </w:rPr>
-          <w:alias w:val="To edit, see citavi.com/edit"/>
-          <w:tag w:val="CitaviPlaceholder#73f11dc6-3dae-4e66-a321-6e91cac5486f"/>
-          <w:id w:val="1220634752"/>
-          <w:placeholder>
-            <w:docPart w:val="DefaultPlaceholder_-1854013440"/>
-          </w:placeholder>
-        </w:sdtPr>
-        <w:sdtContent>
-          <w:r>
-            <w:rPr>
-              <w:lang w:val="en-US"/>
-            </w:rPr>
-            <w:fldChar w:fldCharType="begin"/>
-          </w:r>
-          <w:r>
-            <w:rPr>
-              <w:lang w:val="en-US"/>
-            </w:rPr>
-            <w:instrText>ADDIN CitaviPlaceholder{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}</w:instrText>
-          </w:r>
-          <w:r>
-            <w:rPr>
-              <w:lang w:val="en-US"/>
-            </w:rPr>
-            <w:fldChar w:fldCharType="separate"/>
-          </w:r>
-          <w:r>
-            <w:rPr>
-              <w:lang w:val="en-US"/>
-            </w:rPr>
-            <w:t>(2025)</w:t>
-          </w:r>
-          <w:r>
-            <w:rPr>
-              <w:lang w:val="en-US"/>
-            </w:rPr>
-            <w:fldChar w:fldCharType="end"/>
-          </w:r>
-        </w:sdtContent>
-      </w:sdt>
-      <w:r>
-        <w:rPr>
-          <w:lang w:val="en-US"/>
-        </w:rPr>
-        <w:t xml:space="preserve">, </w:t>
-      </w:r>
-      <w:r>
-        <w:rPr>
-          <w:lang w:val="en-US"/>
-        </w:rPr>
-        <w:t xml:space="preserve">we </w:t>
-      </w:r>
-      <w:r>
-        <w:rPr>
-          <w:lang w:val="en-US"/>
-        </w:rPr>
-        <w:t>maintain that</w:t>
-      </w:r>
-      <w:r>
-        <w:rPr>
-          <w:lang w:val="en-US"/>
-        </w:rPr>
-        <w:t xml:space="preserve"> a full </w:t>
-      </w:r>
-      <w:r>
-        <w:rPr>
-          <w:lang w:val="en-US"/>
-        </w:rPr>
-        <w:t xml:space="preserve">understanding of voice naturalness </w:t>
-      </w:r>
-      <w:r>
-        <w:rPr>
-          <w:lang w:val="en-US"/>
-        </w:rPr>
-        <w:t>requires more systematic research that assesses</w:t>
-      </w:r>
-      <w:r>
-        <w:rPr>
-          <w:lang w:val="en-US"/>
-        </w:rPr>
-        <w:t xml:space="preserve"> differences across listeners and contexts, </w:t>
-      </w:r>
-      <w:r>
-        <w:rPr>
-          <w:color w:val="C00000"/>
-          <w:lang w:val="en-US"/>
-        </w:rPr>
-        <w:t>addressing societal aspects of speech production as well</w:t>
-      </w:r>
-      <w:r>
-        <w:rPr>
-          <w:color w:val="C00000"/>
-          <w:lang w:val="en-US"/>
-        </w:rPr>
-        <w:t xml:space="preserve">. </w:t>
-      </w:r>
-    </w:p>
-    <w:p>
-      <w:pPr>
-        <w:spacing w:line="480" w:lineRule="auto"/>
-        <w:rPr>
           <w:b/>
           <w:bCs/>
           <w:lang w:val="en-US"/>
@@ -4133,7 +3817,7 @@
           <w:bCs/>
           <w:lang w:val="en-US"/>
         </w:rPr>
-        <w:t xml:space="preserve">oice naturalness to self-voice </w:t>
+        <w:t>oice naturalness</w:t>
       </w:r>
       <w:r>
         <w:rPr>
@@ -4141,7 +3825,7 @@
           <w:bCs/>
           <w:lang w:val="en-US"/>
         </w:rPr>
-        <w:t>processin</w:t>
+        <w:t xml:space="preserve"> and authenticity</w:t>
       </w:r>
       <w:r>
         <w:rPr>
@@ -4149,28 +3833,23 @@
           <w:bCs/>
           <w:lang w:val="en-US"/>
         </w:rPr>
-        <w:t xml:space="preserve">g through the concept of </w:t>
-      </w:r>
-      <w:commentRangeStart w:id="2"/>
+        <w:t xml:space="preserve"> to self-voice </w:t>
+      </w:r>
       <w:r>
         <w:rPr>
           <w:b/>
           <w:bCs/>
           <w:lang w:val="en-US"/>
         </w:rPr>
-        <w:t>authenticity</w:t>
-      </w:r>
-      <w:commentRangeEnd w:id="2"/>
-      <w:r>
-        <w:rPr>
-          <w:rStyle w:val="Kommentarzeichen"/>
+        <w:t>processin</w:t>
+      </w:r>
+      <w:r>
+        <w:rPr>
           <w:b/>
           <w:bCs/>
-          <w:sz w:val="22"/>
-          <w:szCs w:val="22"/>
-          <w:lang w:val="en-US"/>
-        </w:rPr>
-        <w:commentReference w:id="2"/>
+          <w:lang w:val="en-US"/>
+        </w:rPr>
+        <w:t xml:space="preserve">g </w:t>
       </w:r>
     </w:p>
     <w:p>
@@ -4209,7 +3888,7 @@
             <w:rPr>
               <w:lang w:val="en-US"/>
             </w:rPr>
-            <w:instrText>ADDIN CitaviPlaceholder{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}</w:instrText>
+            <w:instrText>ADDIN CitaviPlaceholder{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}</w:instrText>
           </w:r>
           <w:r>
             <w:rPr>
@@ -4260,7 +3939,7 @@
             <w:rPr>
               <w:lang w:val="en-US"/>
             </w:rPr>
-            <w:instrText>ADDIN CitaviPlaceholder{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}</w:instrText>
+            <w:instrText>ADDIN CitaviPlaceholder{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}</w:instrText>
           </w:r>
           <w:r>
             <w:rPr>
@@ -4311,7 +3990,7 @@
             <w:rPr>
               <w:lang w:val="en-US"/>
             </w:rPr>
-            <w:instrText>ADDIN CitaviPlaceholder{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}</w:instrText>
+            <w:instrText>ADDIN CitaviPlaceholder{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}</w:instrText>
           </w:r>
           <w:r>
             <w:rPr>
@@ -4362,7 +4041,7 @@
             <w:rPr>
               <w:lang w:val="en-US"/>
             </w:rPr>
-            <w:instrText>ADDIN CitaviPlaceholder{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}</w:instrText>
+            <w:instrText>ADDIN CitaviPlaceholder{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}</w:instrText>
           </w:r>
           <w:r>
             <w:rPr>
@@ -4395,100 +4074,35 @@
           <w:color w:val="C00000"/>
           <w:lang w:val="en-US"/>
         </w:rPr>
-        <w:t xml:space="preserve">Note that </w:t>
-      </w:r>
-      <w:r>
-        <w:rPr>
-          <w:lang w:val="en-US"/>
-        </w:rPr>
-        <w:t>w</w:t>
-      </w:r>
-      <w:r>
-        <w:rPr>
-          <w:lang w:val="en-US"/>
-        </w:rPr>
-        <w:t xml:space="preserve">e intentionally decided to only briefly touch on the issue where relevant, in order </w:t>
-      </w:r>
-      <w:r>
-        <w:rPr>
-          <w:lang w:val="en-US"/>
-        </w:rPr>
-        <w:t>not to</w:t>
-      </w:r>
-      <w:r>
-        <w:rPr>
-          <w:lang w:val="en-US"/>
-        </w:rPr>
-        <w:t xml:space="preserve"> distract from the main points of our paper. What we did consider is an important aspect of self-voice that </w:t>
-      </w:r>
-      <w:r>
-        <w:rPr>
-          <w:lang w:val="en-US"/>
-        </w:rPr>
-        <w:t>provides</w:t>
-      </w:r>
-      <w:r>
-        <w:rPr>
-          <w:lang w:val="en-US"/>
-        </w:rPr>
-        <w:t xml:space="preserve"> substantial motivation for understanding voice naturalness (that was in turn not mentioned by</w:t>
-      </w:r>
-      <w:r>
-        <w:rPr>
-          <w:lang w:val="en-US"/>
-        </w:rPr>
-        <w:t xml:space="preserve"> </w:t>
-      </w:r>
-      <w:sdt>
-        <w:sdtPr>
-          <w:rPr>
-            <w:lang w:val="en-US"/>
-          </w:rPr>
-          <w:alias w:val="To edit, see citavi.com/edit"/>
-          <w:tag w:val="CitaviPlaceholder#d0d6e3bf-9369-4091-a9d3-299c8bf654ef"/>
-          <w:id w:val="-778573103"/>
-          <w:placeholder>
-            <w:docPart w:val="DefaultPlaceholder_-1854013440"/>
-          </w:placeholder>
-        </w:sdtPr>
-        <w:sdtContent>
-          <w:r>
-            <w:rPr>
-              <w:lang w:val="en-US"/>
-            </w:rPr>
-            <w:fldChar w:fldCharType="begin"/>
-          </w:r>
-          <w:r>
-            <w:rPr>
-              <w:lang w:val="en-US"/>
-            </w:rPr>
-            <w:instrText>ADDIN CitaviPlaceholder{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}</w:instrText>
-          </w:r>
-          <w:r>
-            <w:rPr>
-              <w:lang w:val="en-US"/>
-            </w:rPr>
-            <w:fldChar w:fldCharType="separate"/>
-          </w:r>
-          <w:r>
-            <w:rPr>
-              <w:lang w:val="en-US"/>
-            </w:rPr>
-            <w:t>Pinheiro, 2025</w:t>
-          </w:r>
-          <w:r>
-            <w:rPr>
-              <w:lang w:val="en-US"/>
-            </w:rPr>
-            <w:fldChar w:fldCharType="end"/>
-          </w:r>
-        </w:sdtContent>
-      </w:sdt>
-      <w:r>
-        <w:rPr>
-          <w:lang w:val="en-US"/>
-        </w:rPr>
-        <w:t xml:space="preserve">): </w:t>
+        <w:t xml:space="preserve">Note </w:t>
+      </w:r>
+      <w:r>
+        <w:rPr>
+          <w:color w:val="C00000"/>
+          <w:lang w:val="en-US"/>
+        </w:rPr>
+        <w:t>that w</w:t>
+      </w:r>
+      <w:r>
+        <w:rPr>
+          <w:color w:val="C00000"/>
+          <w:lang w:val="en-US"/>
+        </w:rPr>
+        <w:t xml:space="preserve">e intentionally decided to only briefly touch on the issue, </w:t>
+      </w:r>
+      <w:r>
+        <w:rPr>
+          <w:color w:val="C00000"/>
+          <w:lang w:val="en-US"/>
+        </w:rPr>
+        <w:t>but it provided</w:t>
+      </w:r>
+      <w:r>
+        <w:rPr>
+          <w:color w:val="C00000"/>
+          <w:lang w:val="en-US"/>
+        </w:rPr>
+        <w:t xml:space="preserve"> substantial motivation for understanding voice naturalness: </w:t>
       </w:r>
       <w:r>
         <w:rPr>
@@ -4519,7 +4133,7 @@
             <w:rPr>
               <w:lang w:val="en-US"/>
             </w:rPr>
-            <w:instrText>ADDIN CitaviPlaceholder{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}</w:instrText>
+            <w:instrText>ADDIN CitaviPlaceholder{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}</w:instrText>
           </w:r>
           <w:r>
             <w:rPr>
@@ -4570,7 +4184,7 @@
             <w:rPr>
               <w:lang w:val="en-US"/>
             </w:rPr>
-            <w:instrText>ADDIN CitaviPlaceholder{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}</w:instrText>
+            <w:instrText>ADDIN CitaviPlaceholder{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}</w:instrText>
           </w:r>
           <w:r>
             <w:rPr>
@@ -4621,7 +4235,7 @@
             <w:rPr>
               <w:lang w:val="en-US"/>
             </w:rPr>
-            <w:instrText>ADDIN CitaviPlaceholder{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}</w:instrText>
+            <w:instrText>ADDIN CitaviPlaceholder{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}</w:instrText>
           </w:r>
           <w:r>
             <w:rPr>
@@ -4672,7 +4286,7 @@
             <w:rPr>
               <w:lang w:val="en-US"/>
             </w:rPr>
-            <w:instrText>ADDIN CitaviPlaceholder{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}</w:instrText>
+            <w:instrText>ADDIN CitaviPlaceholder{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}</w:instrText>
           </w:r>
           <w:r>
             <w:rPr>
@@ -4710,7 +4324,19 @@
         <w:rPr>
           <w:lang w:val="en-US"/>
         </w:rPr>
-        <w:t>authentic and like “their own natural voice”.</w:t>
+        <w:t xml:space="preserve">authentic </w:t>
+      </w:r>
+      <w:r>
+        <w:rPr>
+          <w:lang w:val="en-US"/>
+        </w:rPr>
+        <w:t>to both the speaker and their next of kin,</w:t>
+      </w:r>
+      <w:r>
+        <w:rPr>
+          <w:lang w:val="en-US"/>
+        </w:rPr>
+        <w:t xml:space="preserve"> like “their own natural voice”.</w:t>
       </w:r>
       <w:r>
         <w:rPr>
@@ -4730,19 +4356,7 @@
         <w:rPr>
           <w:lang w:val="en-US"/>
         </w:rPr>
-        <w:t xml:space="preserve">Nevertheless, we </w:t>
-      </w:r>
-      <w:r>
-        <w:rPr>
-          <w:lang w:val="en-US"/>
-        </w:rPr>
-        <w:t xml:space="preserve">fully </w:t>
-      </w:r>
-      <w:r>
-        <w:rPr>
-          <w:lang w:val="en-US"/>
-        </w:rPr>
-        <w:t xml:space="preserve">agree with </w:t>
+        <w:t xml:space="preserve">Nevertheless, we agree with </w:t>
       </w:r>
       <w:r>
         <w:rPr>
@@ -4785,7 +4399,7 @@
             <w:rPr>
               <w:lang w:val="en-US"/>
             </w:rPr>
-            <w:instrText>ADDIN CitaviPlaceholder{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}</w:instrText>
+            <w:instrText>ADDIN CitaviPlaceholder{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}</w:instrText>
           </w:r>
           <w:r>
             <w:rPr>
@@ -4836,7 +4450,7 @@
             <w:rPr>
               <w:lang w:val="en-US"/>
             </w:rPr>
-            <w:instrText>ADDIN CitaviPlaceholder{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}</w:instrText>
+            <w:instrText>ADDIN CitaviPlaceholder{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}</w:instrText>
           </w:r>
           <w:r>
             <w:rPr>
@@ -4969,7 +4583,7 @@
             <w:rPr>
               <w:lang w:val="en-US"/>
             </w:rPr>
-            <w:instrText>ADDIN CitaviPlaceholder{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}</w:instrText>
+            <w:instrText>ADDIN CitaviPlaceholder{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}</w:instrText>
           </w:r>
           <w:r>
             <w:rPr>
@@ -5020,7 +4634,7 @@
             <w:rPr>
               <w:lang w:val="en-US"/>
             </w:rPr>
-            <w:instrText>ADDIN CitaviPlaceholder{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}</w:instrText>
+            <w:instrText>ADDIN CitaviPlaceholder{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}</w:instrText>
           </w:r>
           <w:r>
             <w:rPr>
@@ -5070,14 +4684,7 @@
         <w:rPr>
           <w:lang w:val="en-US"/>
         </w:rPr>
-        <w:t xml:space="preserve">. Whereas naturalness refers to the holistic impression of a voice (i.e. “does a voice sound natural or unnatural?”), authenticity has been used to refer to specific social </w:t>
-      </w:r>
-      <w:r>
-        <w:rPr>
-          <w:lang w:val="en-US"/>
-        </w:rPr>
-        <w:lastRenderedPageBreak/>
-        <w:t xml:space="preserve">signals, such as emotion, gender or identity (i.e. “does this voice sound like an authentic </w:t>
+        <w:t xml:space="preserve">. Whereas naturalness refers to the holistic impression of a voice (i.e. “does a voice sound natural or unnatural?”), authenticity has been used to refer to specific social signals, such as emotion, gender or identity (i.e. “does this voice sound like an authentic </w:t>
       </w:r>
       <w:r>
         <w:rPr>
@@ -5120,7 +4727,7 @@
             <w:rPr>
               <w:lang w:val="en-US"/>
             </w:rPr>
-            <w:instrText>ADDIN CitaviPlaceholder{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}</w:instrText>
+            <w:instrText>ADDIN CitaviPlaceholder{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}</w:instrText>
           </w:r>
           <w:r>
             <w:rPr>
@@ -5207,13 +4814,45 @@
         <w:rPr>
           <w:lang w:val="en-US"/>
         </w:rPr>
-        <w:t>equivalent to</w:t>
-      </w:r>
-      <w:r>
-        <w:rPr>
-          <w:lang w:val="en-US"/>
-        </w:rPr>
-        <w:t xml:space="preserve"> assessment of authenticity for other speakers’ identities. </w:t>
+        <w:t xml:space="preserve">equivalent </w:t>
+      </w:r>
+      <w:r>
+        <w:rPr>
+          <w:lang w:val="en-US"/>
+        </w:rPr>
+        <w:lastRenderedPageBreak/>
+        <w:t>to</w:t>
+      </w:r>
+      <w:r>
+        <w:rPr>
+          <w:lang w:val="en-US"/>
+        </w:rPr>
+        <w:t xml:space="preserve"> assessment of authenticity for other speakers’ identities</w:t>
+      </w:r>
+      <w:r>
+        <w:rPr>
+          <w:lang w:val="en-US"/>
+        </w:rPr>
+        <w:t>;</w:t>
+      </w:r>
+      <w:r>
+        <w:rPr>
+          <w:lang w:val="en-US"/>
+        </w:rPr>
+        <w:t xml:space="preserve"> </w:t>
+      </w:r>
+      <w:r>
+        <w:rPr>
+          <w:color w:val="C00000"/>
+          <w:lang w:val="en-US"/>
+        </w:rPr>
+        <w:t>their commonalities and differences require further empirical investigation</w:t>
+      </w:r>
+      <w:r>
+        <w:rPr>
+          <w:lang w:val="en-US"/>
+        </w:rPr>
+        <w:t xml:space="preserve">. </w:t>
       </w:r>
       <w:sdt>
         <w:sdtPr>
@@ -5238,7 +4877,7 @@
             <w:rPr>
               <w:lang w:val="en-US"/>
             </w:rPr>
-            <w:instrText>ADDIN CitaviPlaceholder{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}</w:instrText>
+            <w:instrText>ADDIN CitaviPlaceholder{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}</w:instrText>
           </w:r>
           <w:r>
             <w:rPr>
@@ -5289,7 +4928,7 @@
             <w:rPr>
               <w:lang w:val="en-US"/>
             </w:rPr>
-            <w:instrText>ADDIN CitaviPlaceholder{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}</w:instrText>
+            <w:instrText>ADDIN CitaviPlaceholder{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}</w:instrText>
           </w:r>
           <w:r>
             <w:rPr>
@@ -5358,7 +4997,7 @@
             <w:rPr>
               <w:lang w:val="en-US"/>
             </w:rPr>
-            <w:instrText>ADDIN CitaviPlaceholder{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}</w:instrText>
+            <w:instrText>ADDIN CitaviPlaceholder{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}</w:instrText>
           </w:r>
           <w:r>
             <w:rPr>
@@ -5384,13 +5023,50 @@
         <w:rPr>
           <w:lang w:val="en-US"/>
         </w:rPr>
-        <w:t xml:space="preserve">. The consistent conceptual integration of self-voice into the framework of naturalness, and authenticity in particular, </w:t>
-      </w:r>
-      <w:r>
-        <w:rPr>
-          <w:lang w:val="en-US"/>
-        </w:rPr>
-        <w:t xml:space="preserve">thus offers a valuable anchor point for empirical designs that target aspects of impressions that are unique to the self-voice. </w:t>
+        <w:t xml:space="preserve">. </w:t>
+      </w:r>
+      <w:r>
+        <w:rPr>
+          <w:color w:val="C00000"/>
+          <w:lang w:val="en-US"/>
+        </w:rPr>
+        <w:t xml:space="preserve">To this end, </w:t>
+      </w:r>
+      <w:r>
+        <w:rPr>
+          <w:lang w:val="en-US"/>
+        </w:rPr>
+        <w:t>t</w:t>
+      </w:r>
+      <w:r>
+        <w:rPr>
+          <w:lang w:val="en-US"/>
+        </w:rPr>
+        <w:t>he consistent conceptual integration of self-voice into the framework of naturalness, and authenticity in particular,</w:t>
+      </w:r>
+      <w:r>
+        <w:rPr>
+          <w:lang w:val="en-US"/>
+        </w:rPr>
+        <w:t xml:space="preserve"> </w:t>
+      </w:r>
+      <w:r>
+        <w:rPr>
+          <w:lang w:val="en-US"/>
+        </w:rPr>
+        <w:t>offers a valuable anchor point for empirical designs that target</w:t>
+      </w:r>
+      <w:r>
+        <w:rPr>
+          <w:lang w:val="en-US"/>
+        </w:rPr>
+        <w:t xml:space="preserve"> </w:t>
+      </w:r>
+      <w:r>
+        <w:rPr>
+          <w:lang w:val="en-US"/>
+        </w:rPr>
+        <w:t xml:space="preserve">aspects of impressions that are unique to the self-voice. </w:t>
       </w:r>
     </w:p>
     <w:p>
@@ -5567,7 +5243,7 @@
             <w:rPr>
               <w:lang w:val="en-US"/>
             </w:rPr>
-            <w:instrText>ADDIN CitaviPlaceholder{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}</w:instrText>
+            <w:instrText>ADDIN CitaviPlaceholder{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}</w:instrText>
           </w:r>
           <w:r>
             <w:rPr>
@@ -5642,7 +5318,7 @@
             <w:rPr>
               <w:lang w:val="en-US"/>
             </w:rPr>
-            <w:instrText>ADDIN CitaviPlaceholder{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}</w:instrText>
+            <w:instrText>ADDIN CitaviPlaceholder{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}</w:instrText>
           </w:r>
           <w:r>
             <w:rPr>
@@ -5747,7 +5423,7 @@
             <w:rPr>
               <w:lang w:val="en-US"/>
             </w:rPr>
-            <w:instrText>ADDIN CitaviPlaceholder{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}</w:instrText>
+            <w:instrText>ADDIN CitaviPlaceholder{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}</w:instrText>
           </w:r>
           <w:r>
             <w:rPr>
@@ -5788,7 +5464,7 @@
         <w:rPr>
           <w:lang w:val="en-US"/>
         </w:rPr>
-        <w:t>Finally</w:t>
+        <w:t>Another</w:t>
       </w:r>
       <w:commentRangeEnd w:id="3"/>
       <w:r>
@@ -5804,266 +5480,13 @@
         <w:rPr>
           <w:lang w:val="en-US"/>
         </w:rPr>
-        <w:t xml:space="preserve">, we should not forget </w:t>
-      </w:r>
-      <w:r>
-        <w:rPr>
-          <w:lang w:val="en-US"/>
-        </w:rPr>
-        <w:t xml:space="preserve">that </w:t>
-      </w:r>
-      <w:r>
-        <w:rPr>
-          <w:lang w:val="en-US"/>
-        </w:rPr>
-        <w:t xml:space="preserve">impressions about real people </w:t>
-      </w:r>
-      <w:r>
-        <w:rPr>
-          <w:lang w:val="en-US"/>
-        </w:rPr>
-        <w:t>are often</w:t>
-      </w:r>
-      <w:r>
-        <w:rPr>
-          <w:lang w:val="en-US"/>
-        </w:rPr>
-        <w:t xml:space="preserve"> </w:t>
-      </w:r>
-      <w:r>
-        <w:rPr>
-          <w:lang w:val="en-US"/>
-        </w:rPr>
-        <w:t>elicited by</w:t>
-      </w:r>
-      <w:r>
-        <w:rPr>
-          <w:lang w:val="en-US"/>
-        </w:rPr>
-        <w:t xml:space="preserve"> dynamic multisensory (vocal, facial, body motion) cues. T</w:t>
-      </w:r>
-      <w:r>
-        <w:rPr>
-          <w:lang w:val="en-US"/>
-        </w:rPr>
-        <w:t xml:space="preserve">he </w:t>
-      </w:r>
-      <w:r>
-        <w:rPr>
-          <w:lang w:val="en-US"/>
-        </w:rPr>
-        <w:t xml:space="preserve">relatively </w:t>
-      </w:r>
-      <w:r>
-        <w:rPr>
-          <w:lang w:val="en-US"/>
-        </w:rPr>
-        <w:t xml:space="preserve">short </w:t>
-      </w:r>
-      <w:r>
-        <w:rPr>
-          <w:lang w:val="en-US"/>
-        </w:rPr>
-        <w:t xml:space="preserve">but intense </w:t>
-      </w:r>
-      <w:r>
-        <w:rPr>
-          <w:lang w:val="en-US"/>
-        </w:rPr>
-        <w:t xml:space="preserve">history of voice perception research </w:t>
-      </w:r>
-      <w:sdt>
-        <w:sdtPr>
-          <w:rPr>
-            <w:lang w:val="en-US"/>
-          </w:rPr>
-          <w:alias w:val="To edit, see citavi.com/edit"/>
-          <w:tag w:val="CitaviPlaceholder#8ccca0b2-50c5-4eac-9ee5-98edd1bd4a95"/>
-          <w:id w:val="-584145609"/>
-          <w:placeholder>
-            <w:docPart w:val="DefaultPlaceholder_-1854013440"/>
-          </w:placeholder>
-        </w:sdtPr>
-        <w:sdtContent>
-          <w:r>
-            <w:rPr>
-              <w:lang w:val="en-US"/>
-            </w:rPr>
-            <w:fldChar w:fldCharType="begin"/>
-          </w:r>
-          <w:r>
-            <w:rPr>
-              <w:lang w:val="en-US"/>
-            </w:rPr>
-            <w:instrText>ADDIN CitaviPlaceholder{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}</w:instrText>
-          </w:r>
-          <w:r>
-            <w:rPr>
-              <w:lang w:val="en-US"/>
-            </w:rPr>
-            <w:fldChar w:fldCharType="separate"/>
-          </w:r>
-          <w:r>
-            <w:rPr>
-              <w:lang w:val="en-US"/>
-            </w:rPr>
-            <w:t>(Frühholz &amp; Belin, 2018)</w:t>
-          </w:r>
-          <w:r>
-            <w:rPr>
-              <w:lang w:val="en-US"/>
-            </w:rPr>
-            <w:fldChar w:fldCharType="end"/>
-          </w:r>
-        </w:sdtContent>
-      </w:sdt>
-      <w:r>
-        <w:rPr>
-          <w:lang w:val="en-US"/>
-        </w:rPr>
-        <w:t xml:space="preserve"> </w:t>
-      </w:r>
-      <w:r>
-        <w:rPr>
-          <w:lang w:val="en-US"/>
-        </w:rPr>
-        <w:t xml:space="preserve">suggests </w:t>
-      </w:r>
-      <w:r>
-        <w:rPr>
-          <w:lang w:val="en-US"/>
-        </w:rPr>
-        <w:t xml:space="preserve">that the human brain treats voices </w:t>
-      </w:r>
-      <w:r>
-        <w:rPr>
-          <w:lang w:val="en-US"/>
-        </w:rPr>
-        <w:t>and</w:t>
-      </w:r>
-      <w:r>
-        <w:rPr>
-          <w:lang w:val="en-US"/>
-        </w:rPr>
-        <w:t xml:space="preserve"> faces as sources of information about real persons</w:t>
-      </w:r>
-      <w:r>
-        <w:rPr>
-          <w:lang w:val="en-US"/>
-        </w:rPr>
-        <w:t xml:space="preserve">, and </w:t>
-      </w:r>
-      <w:r>
-        <w:rPr>
-          <w:lang w:val="en-US"/>
-        </w:rPr>
-        <w:t xml:space="preserve">that </w:t>
-      </w:r>
-      <w:r>
-        <w:rPr>
-          <w:lang w:val="en-US"/>
-        </w:rPr>
-        <w:t xml:space="preserve">voice perception theory </w:t>
-      </w:r>
-      <w:r>
-        <w:rPr>
-          <w:lang w:val="en-US"/>
-        </w:rPr>
-        <w:t xml:space="preserve">continues to </w:t>
-      </w:r>
-      <w:r>
-        <w:rPr>
-          <w:lang w:val="en-US"/>
-        </w:rPr>
-        <w:t xml:space="preserve">benefit </w:t>
-      </w:r>
-      <w:r>
-        <w:rPr>
-          <w:lang w:val="en-US"/>
-        </w:rPr>
-        <w:t xml:space="preserve">from face perception </w:t>
-      </w:r>
-      <w:r>
-        <w:rPr>
-          <w:lang w:val="en-US"/>
-        </w:rPr>
-        <w:t>models</w:t>
-      </w:r>
-      <w:r>
-        <w:rPr>
-          <w:lang w:val="en-US"/>
-        </w:rPr>
-        <w:t xml:space="preserve"> </w:t>
-      </w:r>
-      <w:sdt>
-        <w:sdtPr>
-          <w:rPr>
-            <w:lang w:val="en-US"/>
-          </w:rPr>
-          <w:alias w:val="To edit, see citavi.com/edit"/>
-          <w:tag w:val="CitaviPlaceholder#cc9340fd-ecd6-45b9-b400-ae8addea86dc"/>
-          <w:id w:val="-1703556034"/>
-          <w:placeholder>
-            <w:docPart w:val="DefaultPlaceholder_-1854013440"/>
-          </w:placeholder>
-        </w:sdtPr>
-        <w:sdtContent>
-          <w:r>
-            <w:rPr>
-              <w:lang w:val="en-US"/>
-            </w:rPr>
-            <w:fldChar w:fldCharType="begin"/>
-          </w:r>
-          <w:r>
-            <w:rPr>
-              <w:lang w:val="en-US"/>
-            </w:rPr>
-            <w:instrText>ADDIN CitaviPlaceholder{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}</w:instrText>
-          </w:r>
-          <w:r>
-            <w:rPr>
-              <w:lang w:val="en-US"/>
-            </w:rPr>
-            <w:fldChar w:fldCharType="separate"/>
-          </w:r>
-          <w:r>
-            <w:rPr>
-              <w:lang w:val="en-US"/>
-            </w:rPr>
-            <w:t>(e.g. Belin et al., 2011; Young et al., 2020)</w:t>
-          </w:r>
-          <w:r>
-            <w:rPr>
-              <w:lang w:val="en-US"/>
-            </w:rPr>
-            <w:fldChar w:fldCharType="end"/>
-          </w:r>
-        </w:sdtContent>
-      </w:sdt>
-      <w:r>
-        <w:rPr>
-          <w:lang w:val="en-US"/>
-        </w:rPr>
-        <w:t xml:space="preserve">. </w:t>
-      </w:r>
-      <w:r>
-        <w:rPr>
-          <w:lang w:val="en-US"/>
-        </w:rPr>
-        <w:t>One</w:t>
-      </w:r>
-      <w:r>
-        <w:rPr>
-          <w:lang w:val="en-US"/>
-        </w:rPr>
-        <w:t xml:space="preserve"> important aspect of self-</w:t>
-      </w:r>
-      <w:r>
-        <w:rPr>
-          <w:lang w:val="en-US"/>
-        </w:rPr>
-        <w:lastRenderedPageBreak/>
-        <w:t>voice, not mentioned by Pinheiro, is kinship recognition</w:t>
+        <w:t xml:space="preserve"> topic that is related to the</w:t>
+      </w:r>
+      <w:r>
+        <w:rPr>
+          <w:lang w:val="en-US"/>
+        </w:rPr>
+        <w:t xml:space="preserve"> self-voice, not mentioned by Pinheiro, is kinship recognition</w:t>
       </w:r>
       <w:r>
         <w:rPr>
@@ -6100,7 +5523,7 @@
             <w:rPr>
               <w:lang w:val="en-US"/>
             </w:rPr>
-            <w:instrText>ADDIN CitaviPlaceholder{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}</w:instrText>
+            <w:instrText>ADDIN CitaviPlaceholder{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}</w:instrText>
           </w:r>
           <w:r>
             <w:rPr>
@@ -6151,7 +5574,7 @@
             <w:rPr>
               <w:lang w:val="en-US"/>
             </w:rPr>
-            <w:instrText>ADDIN CitaviPlaceholder{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}</w:instrText>
+            <w:instrText>ADDIN CitaviPlaceholder{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}</w:instrText>
           </w:r>
           <w:r>
             <w:rPr>
@@ -6195,7 +5618,19 @@
         <w:rPr>
           <w:lang w:val="en-US"/>
         </w:rPr>
-        <w:t>here are good reasons to believe that perceived self-similarity is one of the key mechanisms of kinship recognition</w:t>
+        <w:t xml:space="preserve">here are </w:t>
+      </w:r>
+      <w:r>
+        <w:rPr>
+          <w:lang w:val="en-US"/>
+        </w:rPr>
+        <w:t xml:space="preserve">very </w:t>
+      </w:r>
+      <w:r>
+        <w:rPr>
+          <w:lang w:val="en-US"/>
+        </w:rPr>
+        <w:t>good reasons to believe that perceived self-similarity is one of the key mechanisms of kinship recognition</w:t>
       </w:r>
       <w:r>
         <w:rPr>
@@ -6226,7 +5661,7 @@
             <w:rPr>
               <w:lang w:val="en-US"/>
             </w:rPr>
-            <w:instrText>ADDIN CitaviPlaceholder{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}</w:instrText>
+            <w:instrText>ADDIN CitaviPlaceholder{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}</w:instrText>
           </w:r>
           <w:r>
             <w:rPr>
@@ -6277,7 +5712,7 @@
             <w:rPr>
               <w:lang w:val="en-US"/>
             </w:rPr>
-            <w:instrText>ADDIN CitaviPlaceholder{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}</w:instrText>
+            <w:instrText>ADDIN CitaviPlaceholder{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}</w:instrText>
           </w:r>
           <w:r>
             <w:rPr>
@@ -6305,11 +5740,40 @@
         </w:rPr>
         <w:t xml:space="preserve">. </w:t>
       </w:r>
-      <w:r>
-        <w:rPr>
-          <w:lang w:val="en-US"/>
-        </w:rPr>
-        <w:t xml:space="preserve">But even after decades of self-face perception research, the question of whether the self is special does remain controversial in psychology, neuroscience and philosophy </w:t>
+    </w:p>
+    <w:p>
+      <w:pPr>
+        <w:spacing w:line="480" w:lineRule="auto"/>
+        <w:rPr>
+          <w:lang w:val="en-US"/>
+        </w:rPr>
+      </w:pPr>
+      <w:r>
+        <w:rPr>
+          <w:lang w:val="en-US"/>
+        </w:rPr>
+        <w:lastRenderedPageBreak/>
+        <w:t>Finally,</w:t>
+      </w:r>
+      <w:r>
+        <w:rPr>
+          <w:lang w:val="en-US"/>
+        </w:rPr>
+        <w:t xml:space="preserve"> even after decades of self-</w:t>
+      </w:r>
+      <w:r>
+        <w:rPr>
+          <w:i/>
+          <w:iCs/>
+          <w:lang w:val="en-US"/>
+        </w:rPr>
+        <w:t>face</w:t>
+      </w:r>
+      <w:r>
+        <w:rPr>
+          <w:lang w:val="en-US"/>
+        </w:rPr>
+        <w:t xml:space="preserve"> perception research, the question of whether the self is special does remain controversial in psychology, neuroscience and philosophy </w:t>
       </w:r>
       <w:sdt>
         <w:sdtPr>
@@ -6334,7 +5798,7 @@
             <w:rPr>
               <w:lang w:val="en-US"/>
             </w:rPr>
-            <w:instrText>ADDIN CitaviPlaceholder{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}</w:instrText>
+            <w:instrText>ADDIN CitaviPlaceholder{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}</w:instrText>
           </w:r>
           <w:r>
             <w:rPr>
@@ -6458,7 +5922,19 @@
         <w:rPr>
           <w:lang w:val="en-US"/>
         </w:rPr>
-        <w:t>ongoing work in that direction</w:t>
+        <w:t>recent</w:t>
+      </w:r>
+      <w:r>
+        <w:rPr>
+          <w:lang w:val="en-US"/>
+        </w:rPr>
+        <w:t xml:space="preserve"> </w:t>
+      </w:r>
+      <w:r>
+        <w:rPr>
+          <w:lang w:val="en-US"/>
+        </w:rPr>
+        <w:t>work in that direction</w:t>
       </w:r>
       <w:r>
         <w:rPr>
@@ -6472,8 +5948,8 @@
             <w:lang w:val="en-US"/>
           </w:rPr>
           <w:alias w:val="To edit, see citavi.com/edit"/>
-          <w:tag w:val="CitaviPlaceholder#c4256932-067f-41c5-b716-efae89df24be"/>
-          <w:id w:val="75327132"/>
+          <w:tag w:val="CitaviPlaceholder#80bfc884-e5ad-4b41-835a-cd662f7167c2"/>
+          <w:id w:val="-1996327311"/>
           <w:placeholder>
             <w:docPart w:val="DefaultPlaceholder_-1854013440"/>
           </w:placeholder>
@@ -6489,7 +5965,7 @@
             <w:rPr>
               <w:lang w:val="en-US"/>
             </w:rPr>
-            <w:instrText>ADDIN CitaviPlaceholder{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}</w:instrText>
+            <w:instrText>ADDIN CitaviPlaceholder{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}</w:instrText>
           </w:r>
           <w:r>
             <w:rPr>
@@ -6501,7 +5977,7 @@
             <w:rPr>
               <w:lang w:val="en-US"/>
             </w:rPr>
-            <w:t>(Orepic &amp; Pinheiro, 2025)</w:t>
+            <w:t>(Orepic &amp; Pinheiro, 2026)</w:t>
           </w:r>
           <w:r>
             <w:rPr>
@@ -6515,93 +5991,97 @@
         <w:rPr>
           <w:lang w:val="en-US"/>
         </w:rPr>
+        <w:t>,</w:t>
+      </w:r>
+      <w:r>
+        <w:rPr>
+          <w:lang w:val="en-US"/>
+        </w:rPr>
+        <w:t xml:space="preserve"> </w:t>
+      </w:r>
+      <w:commentRangeStart w:id="4"/>
+      <w:r>
+        <w:rPr>
+          <w:color w:val="C00000"/>
+          <w:lang w:val="en-US"/>
+        </w:rPr>
+        <w:t xml:space="preserve">although </w:t>
+      </w:r>
+      <w:commentRangeEnd w:id="4"/>
+      <w:r>
+        <w:rPr>
+          <w:rStyle w:val="Kommentarzeichen"/>
+          <w:color w:val="C00000"/>
+          <w:sz w:val="22"/>
+          <w:szCs w:val="22"/>
+          <w:lang w:val="en-US"/>
+        </w:rPr>
+        <w:commentReference w:id="4"/>
+      </w:r>
+      <w:r>
+        <w:rPr>
+          <w:color w:val="C00000"/>
+          <w:lang w:val="en-US"/>
+        </w:rPr>
+        <w:t xml:space="preserve">we regret it does not make </w:t>
+      </w:r>
+      <w:r>
+        <w:rPr>
+          <w:color w:val="C00000"/>
+          <w:lang w:val="en-US"/>
+        </w:rPr>
+        <w:t>links</w:t>
+      </w:r>
+      <w:r>
+        <w:rPr>
+          <w:color w:val="C00000"/>
+          <w:lang w:val="en-US"/>
+        </w:rPr>
+        <w:t xml:space="preserve"> to our conceptual framework for voice naturalness</w:t>
+      </w:r>
+      <w:r>
+        <w:rPr>
+          <w:lang w:val="en-US"/>
+        </w:rPr>
+        <w:t xml:space="preserve">. </w:t>
+      </w:r>
+      <w:r>
+        <w:rPr>
+          <w:color w:val="C00000"/>
+          <w:lang w:val="en-US"/>
+        </w:rPr>
+        <w:t xml:space="preserve">We </w:t>
+      </w:r>
+      <w:r>
+        <w:rPr>
+          <w:color w:val="C00000"/>
+          <w:lang w:val="en-US"/>
+        </w:rPr>
+        <w:t xml:space="preserve">add that </w:t>
+      </w:r>
+      <w:r>
+        <w:rPr>
+          <w:lang w:val="en-US"/>
+        </w:rPr>
+        <w:t>future consideration of kinship perception might promote further understanding of a putative relationship between naturalness and self-relevance</w:t>
+      </w:r>
+      <w:r>
+        <w:rPr>
+          <w:lang w:val="en-US"/>
+        </w:rPr>
         <w:t>.</w:t>
       </w:r>
-    </w:p>
-    <w:p>
-      <w:pPr>
-        <w:spacing w:line="480" w:lineRule="auto"/>
-        <w:rPr>
-          <w:lang w:val="en-US"/>
-        </w:rPr>
-      </w:pPr>
-      <w:r>
-        <w:rPr>
-          <w:lang w:val="en-US"/>
-        </w:rPr>
-        <w:t xml:space="preserve">In </w:t>
-      </w:r>
-      <w:r>
-        <w:rPr>
-          <w:lang w:val="en-US"/>
-        </w:rPr>
-        <w:t>conclusion</w:t>
-      </w:r>
-      <w:r>
-        <w:rPr>
-          <w:lang w:val="en-US"/>
-        </w:rPr>
-        <w:t xml:space="preserve">, </w:t>
-      </w:r>
-      <w:r>
-        <w:rPr>
-          <w:lang w:val="en-US"/>
-        </w:rPr>
-        <w:t xml:space="preserve">we </w:t>
-      </w:r>
-      <w:r>
-        <w:rPr>
-          <w:lang w:val="en-US"/>
-        </w:rPr>
-        <w:t xml:space="preserve">appreciate that the response to this letter gave us the chance to </w:t>
-      </w:r>
-      <w:r>
-        <w:rPr>
-          <w:lang w:val="en-US"/>
-        </w:rPr>
-        <w:t>clarif</w:t>
-      </w:r>
-      <w:r>
-        <w:rPr>
-          <w:lang w:val="en-US"/>
-        </w:rPr>
-        <w:t>y</w:t>
-      </w:r>
-      <w:r>
-        <w:rPr>
-          <w:lang w:val="en-US"/>
-        </w:rPr>
-        <w:t xml:space="preserve"> how </w:t>
-      </w:r>
-      <w:r>
-        <w:rPr>
-          <w:lang w:val="en-US"/>
-        </w:rPr>
-        <w:t xml:space="preserve">the </w:t>
-      </w:r>
-      <w:r>
-        <w:rPr>
-          <w:lang w:val="en-US"/>
-        </w:rPr>
-        <w:t xml:space="preserve">self-voice can be </w:t>
-      </w:r>
-      <w:r>
-        <w:rPr>
-          <w:lang w:val="en-US"/>
-        </w:rPr>
-        <w:t xml:space="preserve">seamlessly </w:t>
-      </w:r>
-      <w:r>
-        <w:rPr>
-          <w:lang w:val="en-US"/>
-        </w:rPr>
-        <w:t xml:space="preserve">linked to our existing </w:t>
-      </w:r>
-      <w:r>
-        <w:rPr>
-          <w:lang w:val="en-US"/>
-        </w:rPr>
-        <w:t>framework</w:t>
+      <w:r>
+        <w:rPr>
+          <w:lang w:val="en-US"/>
+        </w:rPr>
+        <w:t xml:space="preserve"> W</w:t>
+      </w:r>
+      <w:r>
+        <w:rPr>
+          <w:lang w:val="en-US"/>
+        </w:rPr>
+        <w:t>e</w:t>
       </w:r>
       <w:r>
         <w:rPr>
@@ -6613,19 +6093,7 @@
         <w:rPr>
           <w:lang w:val="en-US"/>
         </w:rPr>
-        <w:t>of voice naturalness</w:t>
-      </w:r>
-      <w:r>
-        <w:rPr>
-          <w:lang w:val="en-US"/>
-        </w:rPr>
-        <w:t xml:space="preserve">. </w:t>
-      </w:r>
-      <w:r>
-        <w:rPr>
-          <w:lang w:val="en-US"/>
-        </w:rPr>
-        <w:t>We</w:t>
+        <w:t>look forward to</w:t>
       </w:r>
       <w:r>
         <w:rPr>
@@ -6637,7 +6105,13 @@
         <w:rPr>
           <w:lang w:val="en-US"/>
         </w:rPr>
-        <w:t>look forward to</w:t>
+        <w:t xml:space="preserve">empirical </w:t>
+      </w:r>
+      <w:r>
+        <w:rPr>
+          <w:lang w:val="en-US"/>
+        </w:rPr>
+        <w:t>contributions that</w:t>
       </w:r>
       <w:r>
         <w:rPr>
@@ -6649,19 +6123,7 @@
         <w:rPr>
           <w:lang w:val="en-US"/>
         </w:rPr>
-        <w:t xml:space="preserve">empirical </w:t>
-      </w:r>
-      <w:r>
-        <w:rPr>
-          <w:lang w:val="en-US"/>
-        </w:rPr>
-        <w:t xml:space="preserve">contributions </w:t>
-      </w:r>
-      <w:r>
-        <w:rPr>
-          <w:lang w:val="en-US"/>
-        </w:rPr>
-        <w:t>that</w:t>
+        <w:t>increase our</w:t>
       </w:r>
       <w:r>
         <w:rPr>
@@ -6673,25 +6135,7 @@
         <w:rPr>
           <w:lang w:val="en-US"/>
         </w:rPr>
-        <w:t>li</w:t>
-      </w:r>
-      <w:r>
-        <w:rPr>
-          <w:lang w:val="en-US"/>
-        </w:rPr>
-        <w:t>n</w:t>
-      </w:r>
-      <w:r>
-        <w:rPr>
-          <w:lang w:val="en-US"/>
-        </w:rPr>
-        <w:t>k phenomena of self-voice p</w:t>
-      </w:r>
-      <w:r>
-        <w:rPr>
-          <w:lang w:val="en-US"/>
-        </w:rPr>
-        <w:t>rocessing</w:t>
+        <w:t>understanding</w:t>
       </w:r>
       <w:r>
         <w:rPr>
@@ -6703,49 +6147,19 @@
         <w:rPr>
           <w:lang w:val="en-US"/>
         </w:rPr>
-        <w:t xml:space="preserve">to </w:t>
-      </w:r>
-      <w:r>
-        <w:rPr>
-          <w:lang w:val="en-US"/>
-        </w:rPr>
-        <w:t xml:space="preserve">this </w:t>
-      </w:r>
-      <w:r>
-        <w:rPr>
-          <w:lang w:val="en-US"/>
-        </w:rPr>
-        <w:t>framework and</w:t>
-      </w:r>
-      <w:r>
-        <w:rPr>
-          <w:lang w:val="en-US"/>
-        </w:rPr>
-        <w:t xml:space="preserve"> expect that these will be helpful to further develop and refine the model</w:t>
-      </w:r>
-      <w:r>
-        <w:rPr>
-          <w:lang w:val="en-US"/>
-        </w:rPr>
-        <w:t xml:space="preserve">. </w:t>
-      </w:r>
-      <w:r>
-        <w:rPr>
-          <w:lang w:val="en-US"/>
-        </w:rPr>
-        <w:t xml:space="preserve">With increasingly sophisticated </w:t>
-      </w:r>
-      <w:r>
-        <w:rPr>
-          <w:lang w:val="en-US"/>
-        </w:rPr>
-        <w:t>studies</w:t>
-      </w:r>
-      <w:r>
-        <w:rPr>
-          <w:lang w:val="en-US"/>
-        </w:rPr>
-        <w:t>, we are confident that future</w:t>
+        <w:t xml:space="preserve">of both </w:t>
+      </w:r>
+      <w:r>
+        <w:rPr>
+          <w:lang w:val="en-US"/>
+        </w:rPr>
+        <w:t xml:space="preserve">self-voice </w:t>
+      </w:r>
+      <w:r>
+        <w:rPr>
+          <w:lang w:val="en-US"/>
+        </w:rPr>
+        <w:t>processing</w:t>
       </w:r>
       <w:r>
         <w:rPr>
@@ -6757,121 +6171,30 @@
         <w:rPr>
           <w:lang w:val="en-US"/>
         </w:rPr>
-        <w:t>research program</w:t>
-      </w:r>
-      <w:r>
-        <w:rPr>
-          <w:lang w:val="en-US"/>
-        </w:rPr>
-        <w:t>s</w:t>
-      </w:r>
-      <w:r>
-        <w:rPr>
-          <w:lang w:val="en-US"/>
-        </w:rPr>
-        <w:t xml:space="preserve"> </w:t>
-      </w:r>
-      <w:r>
-        <w:rPr>
-          <w:lang w:val="en-US"/>
-        </w:rPr>
-        <w:t>will</w:t>
-      </w:r>
-      <w:r>
-        <w:rPr>
-          <w:lang w:val="en-US"/>
-        </w:rPr>
-        <w:t xml:space="preserve"> </w:t>
-      </w:r>
-      <w:r>
-        <w:rPr>
-          <w:lang w:val="en-US"/>
-        </w:rPr>
-        <w:t xml:space="preserve">address these </w:t>
-      </w:r>
-      <w:r>
-        <w:rPr>
-          <w:lang w:val="en-US"/>
-        </w:rPr>
-        <w:t>challenges and</w:t>
-      </w:r>
-      <w:r>
-        <w:rPr>
-          <w:lang w:val="en-US"/>
-        </w:rPr>
-        <w:t xml:space="preserve"> </w:t>
-      </w:r>
-      <w:r>
-        <w:rPr>
-          <w:lang w:val="en-US"/>
-        </w:rPr>
-        <w:t>promote</w:t>
-      </w:r>
-      <w:r>
-        <w:rPr>
-          <w:lang w:val="en-US"/>
-        </w:rPr>
-        <w:t xml:space="preserve"> further progress </w:t>
-      </w:r>
-      <w:r>
-        <w:rPr>
-          <w:lang w:val="en-US"/>
-        </w:rPr>
-        <w:t>that will mutually benefit</w:t>
-      </w:r>
-      <w:r>
-        <w:rPr>
-          <w:lang w:val="en-US"/>
-        </w:rPr>
-        <w:t xml:space="preserve"> a better </w:t>
-      </w:r>
-      <w:r>
-        <w:rPr>
-          <w:lang w:val="en-US"/>
-        </w:rPr>
-        <w:t>understanding</w:t>
-      </w:r>
-      <w:r>
-        <w:rPr>
-          <w:lang w:val="en-US"/>
-        </w:rPr>
-        <w:t xml:space="preserve"> </w:t>
-      </w:r>
-      <w:r>
-        <w:rPr>
-          <w:lang w:val="en-US"/>
-        </w:rPr>
-        <w:t xml:space="preserve">of both </w:t>
-      </w:r>
-      <w:r>
-        <w:rPr>
-          <w:lang w:val="en-US"/>
-        </w:rPr>
-        <w:t xml:space="preserve">self-voice </w:t>
-      </w:r>
-      <w:r>
-        <w:rPr>
-          <w:lang w:val="en-US"/>
-        </w:rPr>
-        <w:t>processing</w:t>
-      </w:r>
-      <w:r>
-        <w:rPr>
-          <w:lang w:val="en-US"/>
-        </w:rPr>
-        <w:t xml:space="preserve"> </w:t>
-      </w:r>
-      <w:r>
-        <w:rPr>
-          <w:lang w:val="en-US"/>
-        </w:rPr>
         <w:t xml:space="preserve">and voice </w:t>
       </w:r>
       <w:r>
         <w:rPr>
           <w:lang w:val="en-US"/>
         </w:rPr>
-        <w:t>naturalness impressions</w:t>
+        <w:t xml:space="preserve">naturalness </w:t>
+      </w:r>
+      <w:commentRangeStart w:id="5"/>
+      <w:r>
+        <w:rPr>
+          <w:lang w:val="en-US"/>
+        </w:rPr>
+        <w:t>impressions</w:t>
+      </w:r>
+      <w:commentRangeEnd w:id="5"/>
+      <w:r>
+        <w:rPr>
+          <w:rStyle w:val="Kommentarzeichen"/>
+          <w:sz w:val="22"/>
+          <w:szCs w:val="22"/>
+          <w:lang w:val="en-US"/>
+        </w:rPr>
+        <w:commentReference w:id="5"/>
       </w:r>
       <w:r>
         <w:rPr>
@@ -6953,7 +6276,25 @@
           <w:color w:val="1D1B1B"/>
           <w:lang w:val="en-US"/>
         </w:rPr>
-        <w:t xml:space="preserve">for helpful suggestions about a previous version of this work. </w:t>
+        <w:t xml:space="preserve">for helpful suggestions </w:t>
+      </w:r>
+      <w:r>
+        <w:rPr>
+          <w:rFonts w:cstheme="minorHAnsi"/>
+          <w:bCs/>
+          <w:color w:val="1D1B1B"/>
+          <w:lang w:val="en-US"/>
+        </w:rPr>
+        <w:t>on</w:t>
+      </w:r>
+      <w:r>
+        <w:rPr>
+          <w:rFonts w:cstheme="minorHAnsi"/>
+          <w:bCs/>
+          <w:color w:val="1D1B1B"/>
+          <w:lang w:val="en-US"/>
+        </w:rPr>
+        <w:t xml:space="preserve"> a previous version of this work. </w:t>
       </w:r>
       <w:r>
         <w:rPr>
@@ -7055,7 +6396,10 @@
     <w:sdt>
       <w:sdtPr>
         <w:rPr>
-          <w:rFonts w:eastAsiaTheme="minorHAnsi"/>
+          <w:rFonts w:asciiTheme="minorHAnsi" w:eastAsiaTheme="minorHAnsi" w:hAnsiTheme="minorHAnsi" w:cstheme="minorBidi"/>
+          <w:color w:val="auto"/>
+          <w:sz w:val="22"/>
+          <w:szCs w:val="22"/>
           <w:lang w:val="en-US"/>
         </w:rPr>
         <w:tag w:val="CitaviBibliography"/>
@@ -7064,18 +6408,13 @@
           <w:docPart w:val="DefaultPlaceholder_-1854013440"/>
         </w:placeholder>
       </w:sdtPr>
-      <w:sdtEndPr>
-        <w:rPr>
-          <w:rFonts w:asciiTheme="minorHAnsi" w:hAnsiTheme="minorHAnsi" w:cstheme="minorBidi"/>
-          <w:color w:val="auto"/>
-          <w:sz w:val="22"/>
-          <w:szCs w:val="22"/>
-        </w:rPr>
-      </w:sdtEndPr>
       <w:sdtContent>
         <w:p>
           <w:pPr>
             <w:pStyle w:val="CitaviBibliographyHeading"/>
+            <w:rPr>
+              <w:lang w:val="en-US"/>
+            </w:rPr>
           </w:pPr>
           <w:r>
             <w:rPr>
@@ -7084,6 +6423,9 @@
             <w:fldChar w:fldCharType="begin"/>
           </w:r>
           <w:r>
+            <w:rPr>
+              <w:lang w:val="en-US"/>
+            </w:rPr>
             <w:instrText>ADDIN CitaviBibliography</w:instrText>
           </w:r>
           <w:r>
@@ -7093,6 +6435,9 @@
             <w:fldChar w:fldCharType="separate"/>
           </w:r>
           <w:r>
+            <w:rPr>
+              <w:lang w:val="en-US"/>
+            </w:rPr>
             <w:t>References</w:t>
           </w:r>
         </w:p>
@@ -7103,17 +6448,14 @@
               <w:lang w:val="en-US"/>
             </w:rPr>
           </w:pPr>
-          <w:bookmarkStart w:id="4" w:name="_CTVL001872a0bd54a2d42f483613d3eb82d0fe3"/>
-          <w:r>
-            <w:t xml:space="preserve">Nussbaum, C., Frühholz, S., &amp; Schweinberger, S. R. (2025). </w:t>
-          </w:r>
-          <w:r>
-            <w:rPr>
-              <w:lang w:val="en-US"/>
-            </w:rPr>
-            <w:t>Understanding voice naturalness.</w:t>
-          </w:r>
-          <w:bookmarkEnd w:id="4"/>
+          <w:bookmarkStart w:id="6" w:name="_CTVL0012dd5f700c4e04db09175a3ec98625a13"/>
+          <w:r>
+            <w:rPr>
+              <w:lang w:val="en-US"/>
+            </w:rPr>
+            <w:t>DeBruine, L. M., Smith, F. G., Jones, B. C., Roberts, S. C., Petrie, M., &amp; Spector, T. D. (2009). Kin recognition signals in adult faces.</w:t>
+          </w:r>
+          <w:bookmarkEnd w:id="6"/>
           <w:r>
             <w:rPr>
               <w:lang w:val="en-US"/>
@@ -7125,7 +6467,7 @@
               <w:i/>
               <w:lang w:val="en-US"/>
             </w:rPr>
-            <w:t>Trends in Cognitive Sciences</w:t>
+            <w:t>Vision Res</w:t>
           </w:r>
           <w:r>
             <w:rPr>
@@ -7138,30 +6480,30 @@
               <w:i/>
               <w:lang w:val="en-US"/>
             </w:rPr>
-            <w:t>29</w:t>
-          </w:r>
-          <w:r>
-            <w:rPr>
-              <w:lang w:val="en-US"/>
-            </w:rPr>
-            <w:t>(5), 467–480. https://doi.org/10.1016/j.tics.2025.01.010</w:t>
+            <w:t>49</w:t>
+          </w:r>
+          <w:r>
+            <w:rPr>
+              <w:lang w:val="en-US"/>
+            </w:rPr>
+            <w:t>(1), 38–43. https://doi.org/10.1016/j.visres.2008.09.025</w:t>
           </w:r>
         </w:p>
         <w:p>
           <w:pPr>
             <w:pStyle w:val="CitaviBibliographyEntry"/>
-            <w:rPr>
-              <w:lang w:val="en-US"/>
-            </w:rPr>
           </w:pPr>
-          <w:bookmarkStart w:id="5" w:name="_CTVL001b9676ab1e5684c59b62432858caa6e4f"/>
-          <w:r>
-            <w:rPr>
-              <w:lang w:val="en-US"/>
-            </w:rPr>
-            <w:t>Pandey, A., Le Maguer, S., &amp; Harte, N. (2025). What is Naturalness? In</w:t>
-          </w:r>
-          <w:bookmarkEnd w:id="5"/>
+          <w:bookmarkStart w:id="7" w:name="_CTVL001ea1526d28f4a4bfd8cbb27222a58911f"/>
+          <w:r>
+            <w:t xml:space="preserve">Frühholz, S., &amp; Schweinberger, S. R. (2021). </w:t>
+          </w:r>
+          <w:r>
+            <w:rPr>
+              <w:lang w:val="en-US"/>
+            </w:rPr>
+            <w:t>Nonverbal auditory communication - Evidence for integrated neural systems for voice signal production and perception.</w:t>
+          </w:r>
+          <w:bookmarkEnd w:id="7"/>
           <w:r>
             <w:rPr>
               <w:lang w:val="en-US"/>
@@ -7171,15 +6513,20 @@
           <w:r>
             <w:rPr>
               <w:i/>
-              <w:lang w:val="en-US"/>
-            </w:rPr>
-            <w:t xml:space="preserve">13th edition of the Speech Synthesis Workshop </w:t>
-          </w:r>
-          <w:r>
-            <w:rPr>
-              <w:lang w:val="en-US"/>
-            </w:rPr>
-            <w:t>(pp. 215–221). ISCA. https://doi.org/10.21437/SSW.2025-33</w:t>
+            </w:rPr>
+            <w:t>Progress in Neurobiology</w:t>
+          </w:r>
+          <w:r>
+            <w:t xml:space="preserve">, </w:t>
+          </w:r>
+          <w:r>
+            <w:rPr>
+              <w:i/>
+            </w:rPr>
+            <w:t>199</w:t>
+          </w:r>
+          <w:r>
+            <w:t>, 101948. https://doi.org/10.1016/j.pneurobio.2020.101948</w:t>
           </w:r>
         </w:p>
         <w:p>
@@ -7189,14 +6536,592 @@
               <w:lang w:val="en-US"/>
             </w:rPr>
           </w:pPr>
-          <w:bookmarkStart w:id="6" w:name="_CTVL0015455222ba26a4de58c36fd167329696a"/>
+          <w:bookmarkStart w:id="8" w:name="_CTVL001ae80c5ee55574e2a8031ca141080f218"/>
+          <w:r>
+            <w:t xml:space="preserve">Hyppa-Martin, J., Lilley, J., Chen, M., Friese, J., Schmidt, C., &amp; Bunnell, H. T. (2024). </w:t>
+          </w:r>
+          <w:r>
+            <w:rPr>
+              <w:lang w:val="en-US"/>
+            </w:rPr>
+            <w:t>A large-scale comparison of two voice synthesis techniques on intelligibility, naturalness, preferences, and attitudes toward voices banked by individuals with amyotrophic lateral sclerosis.</w:t>
+          </w:r>
+          <w:bookmarkEnd w:id="8"/>
+          <w:r>
+            <w:rPr>
+              <w:lang w:val="en-US"/>
+            </w:rPr>
+            <w:t xml:space="preserve"> </w:t>
+          </w:r>
+          <w:r>
+            <w:rPr>
+              <w:i/>
+              <w:lang w:val="en-US"/>
+            </w:rPr>
+            <w:t>Augmentative and Alternative Communication</w:t>
+          </w:r>
+          <w:r>
+            <w:rPr>
+              <w:lang w:val="en-US"/>
+            </w:rPr>
+            <w:t xml:space="preserve">, </w:t>
+          </w:r>
+          <w:r>
+            <w:rPr>
+              <w:i/>
+              <w:lang w:val="en-US"/>
+            </w:rPr>
+            <w:t>40</w:t>
+          </w:r>
+          <w:r>
+            <w:rPr>
+              <w:lang w:val="en-US"/>
+            </w:rPr>
+            <w:t>(1), 31–45. https://doi.org/10.1080/07434618.2023.2262032</w:t>
+          </w:r>
+        </w:p>
+        <w:p>
+          <w:pPr>
+            <w:pStyle w:val="CitaviBibliographyEntry"/>
+            <w:rPr>
+              <w:lang w:val="en-US"/>
+            </w:rPr>
+          </w:pPr>
+          <w:bookmarkStart w:id="9" w:name="_CTVL0011668ab7cd410419e9aefa6881534a39a"/>
+          <w:r>
+            <w:rPr>
+              <w:lang w:val="en-US"/>
+            </w:rPr>
+            <w:t xml:space="preserve">Kapolowicz, M. R., Guest, D. R., Montazeri, V., Baese-Berk, M. M., &amp; Assmann, P. F. (2022). Effects of Spectral Envelope and Fundamental Frequency Shifts on the Perception of Foreign-Accented </w:t>
+          </w:r>
+          <w:r>
+            <w:rPr>
+              <w:lang w:val="en-US"/>
+            </w:rPr>
+            <w:lastRenderedPageBreak/>
+            <w:t>Speech.</w:t>
+          </w:r>
+          <w:bookmarkEnd w:id="9"/>
+          <w:r>
+            <w:rPr>
+              <w:lang w:val="en-US"/>
+            </w:rPr>
+            <w:t xml:space="preserve"> </w:t>
+          </w:r>
+          <w:r>
+            <w:rPr>
+              <w:i/>
+              <w:lang w:val="en-US"/>
+            </w:rPr>
+            <w:t>Language and Speech</w:t>
+          </w:r>
+          <w:r>
+            <w:rPr>
+              <w:lang w:val="en-US"/>
+            </w:rPr>
+            <w:t xml:space="preserve">, </w:t>
+          </w:r>
+          <w:r>
+            <w:rPr>
+              <w:i/>
+              <w:lang w:val="en-US"/>
+            </w:rPr>
+            <w:t>65</w:t>
+          </w:r>
+          <w:r>
+            <w:rPr>
+              <w:lang w:val="en-US"/>
+            </w:rPr>
+            <w:t>(2), 418–443. https://doi.org/10.1177/00238309211029679</w:t>
+          </w:r>
+        </w:p>
+        <w:p>
+          <w:pPr>
+            <w:pStyle w:val="CitaviBibliographyEntry"/>
+            <w:rPr>
+              <w:lang w:val="en-US"/>
+            </w:rPr>
+          </w:pPr>
+          <w:bookmarkStart w:id="10" w:name="_CTVL0016dbd513c46ad443c91d5cd8367ad72bb"/>
+          <w:r>
+            <w:rPr>
+              <w:lang w:val="en-US"/>
+            </w:rPr>
+            <w:t>Kovács, G., Göschel, L., Pawlik, S. M., &amp; Tramacere, A. (2025). The neural dynamics of current and past self-face perception: Challenging the privilege access hypothesis.</w:t>
+          </w:r>
+          <w:bookmarkEnd w:id="10"/>
+          <w:r>
+            <w:rPr>
+              <w:lang w:val="en-US"/>
+            </w:rPr>
+            <w:t xml:space="preserve"> </w:t>
+          </w:r>
+          <w:r>
+            <w:rPr>
+              <w:i/>
+              <w:lang w:val="en-US"/>
+            </w:rPr>
+            <w:t>Cortex; a Journal Devoted to the Study of the Nervous System and Behavior</w:t>
+          </w:r>
+          <w:r>
+            <w:rPr>
+              <w:lang w:val="en-US"/>
+            </w:rPr>
+            <w:t xml:space="preserve">, </w:t>
+          </w:r>
+          <w:r>
+            <w:rPr>
+              <w:i/>
+              <w:lang w:val="en-US"/>
+            </w:rPr>
+            <w:t>194</w:t>
+          </w:r>
+          <w:r>
+            <w:rPr>
+              <w:lang w:val="en-US"/>
+            </w:rPr>
+            <w:t>, 77–90. https://doi.org/10.1016/j.cortex.2025.11.006</w:t>
+          </w:r>
+        </w:p>
+        <w:p>
+          <w:pPr>
+            <w:pStyle w:val="CitaviBibliographyEntry"/>
+            <w:rPr>
+              <w:lang w:val="en-US"/>
+            </w:rPr>
+          </w:pPr>
+          <w:bookmarkStart w:id="11" w:name="_CTVL001119f069538084cc0afa0ce98f08c90db"/>
+          <w:r>
+            <w:rPr>
+              <w:lang w:val="en-US"/>
+            </w:rPr>
+            <w:t>Lavan, N., Irvine, M., Rosi, V., &amp; McGettigan, C. (2025). Voice clones sound realistic but not (yet) hyperrealistic.</w:t>
+          </w:r>
+          <w:bookmarkEnd w:id="11"/>
+          <w:r>
+            <w:rPr>
+              <w:lang w:val="en-US"/>
+            </w:rPr>
+            <w:t xml:space="preserve"> </w:t>
+          </w:r>
+          <w:r>
+            <w:rPr>
+              <w:i/>
+              <w:lang w:val="en-US"/>
+            </w:rPr>
+            <w:t>PLoS One</w:t>
+          </w:r>
+          <w:r>
+            <w:rPr>
+              <w:lang w:val="en-US"/>
+            </w:rPr>
+            <w:t xml:space="preserve">, </w:t>
+          </w:r>
+          <w:r>
+            <w:rPr>
+              <w:i/>
+              <w:lang w:val="en-US"/>
+            </w:rPr>
+            <w:t>20</w:t>
+          </w:r>
+          <w:r>
+            <w:rPr>
+              <w:lang w:val="en-US"/>
+            </w:rPr>
+            <w:t>(9), e0332692. https://doi.org/10.1371/journal.pone.0332692</w:t>
+          </w:r>
+        </w:p>
+        <w:p>
+          <w:pPr>
+            <w:pStyle w:val="CitaviBibliographyEntry"/>
+            <w:rPr>
+              <w:lang w:val="en-US"/>
+            </w:rPr>
+          </w:pPr>
+          <w:bookmarkStart w:id="12" w:name="_CTVL001336c0a9a324c431a956472a7daab8a11"/>
+          <w:r>
+            <w:rPr>
+              <w:lang w:val="en-US"/>
+            </w:rPr>
+            <w:t>Lee, E.</w:t>
+          </w:r>
+          <w:r>
+            <w:rPr>
+              <w:rFonts w:ascii="Cambria Math" w:hAnsi="Cambria Math" w:cs="Cambria Math"/>
+              <w:lang w:val="en-US"/>
+            </w:rPr>
+            <w:t>‑</w:t>
+          </w:r>
+          <w:r>
+            <w:rPr>
+              <w:lang w:val="en-US"/>
+            </w:rPr>
+            <w:t>J. (2010). The more humanlike, the better? How speech type and users</w:t>
+          </w:r>
+          <w:r>
+            <w:rPr>
+              <w:rFonts w:ascii="Calibri" w:hAnsi="Calibri" w:cs="Calibri"/>
+              <w:lang w:val="en-US"/>
+            </w:rPr>
+            <w:t>’</w:t>
+          </w:r>
+          <w:r>
+            <w:rPr>
+              <w:lang w:val="en-US"/>
+            </w:rPr>
+            <w:t xml:space="preserve"> cognitive style affect social responses to computers.</w:t>
+          </w:r>
+          <w:bookmarkEnd w:id="12"/>
+          <w:r>
+            <w:rPr>
+              <w:lang w:val="en-US"/>
+            </w:rPr>
+            <w:t xml:space="preserve"> </w:t>
+          </w:r>
+          <w:r>
+            <w:rPr>
+              <w:i/>
+              <w:lang w:val="en-US"/>
+            </w:rPr>
+            <w:t>Computers in Human Behavior</w:t>
+          </w:r>
+          <w:r>
+            <w:rPr>
+              <w:lang w:val="en-US"/>
+            </w:rPr>
+            <w:t xml:space="preserve">, </w:t>
+          </w:r>
+          <w:r>
+            <w:rPr>
+              <w:i/>
+              <w:lang w:val="en-US"/>
+            </w:rPr>
+            <w:t>26</w:t>
+          </w:r>
+          <w:r>
+            <w:rPr>
+              <w:lang w:val="en-US"/>
+            </w:rPr>
+            <w:t>(4), 665–672. https://doi.org/10.1016/j.chb.2010.01.003</w:t>
+          </w:r>
+        </w:p>
+        <w:p>
+          <w:pPr>
+            <w:pStyle w:val="CitaviBibliographyEntry"/>
+            <w:rPr>
+              <w:lang w:val="en-US"/>
+            </w:rPr>
+          </w:pPr>
+          <w:bookmarkStart w:id="13" w:name="_CTVL001929ae89f05734acbb13c08fb32e0991f"/>
+          <w:r>
+            <w:rPr>
+              <w:lang w:val="en-US"/>
+            </w:rPr>
+            <w:t>Maloney, L. T., &amp; Dal Martello, M. F. (2006). Kin recognition and the perceived facial similarity of children.</w:t>
+          </w:r>
+          <w:bookmarkEnd w:id="13"/>
+          <w:r>
+            <w:rPr>
+              <w:lang w:val="en-US"/>
+            </w:rPr>
+            <w:t xml:space="preserve"> </w:t>
+          </w:r>
+          <w:r>
+            <w:rPr>
+              <w:i/>
+              <w:lang w:val="en-US"/>
+            </w:rPr>
+            <w:t>Journal of Vision</w:t>
+          </w:r>
+          <w:r>
+            <w:rPr>
+              <w:lang w:val="en-US"/>
+            </w:rPr>
+            <w:t xml:space="preserve">, </w:t>
+          </w:r>
+          <w:r>
+            <w:rPr>
+              <w:i/>
+              <w:lang w:val="en-US"/>
+            </w:rPr>
+            <w:t>6</w:t>
+          </w:r>
+          <w:r>
+            <w:rPr>
+              <w:lang w:val="en-US"/>
+            </w:rPr>
+            <w:t>(10), 1047–1056. https://doi.org/10.1167/6.10.4</w:t>
+          </w:r>
+        </w:p>
+        <w:p>
+          <w:pPr>
+            <w:pStyle w:val="CitaviBibliographyEntry"/>
+            <w:rPr>
+              <w:lang w:val="en-US"/>
+            </w:rPr>
+          </w:pPr>
+          <w:bookmarkStart w:id="14" w:name="_CTVL001a41221023d83451484034bf88cfe9a4a"/>
+          <w:r>
+            <w:rPr>
+              <w:lang w:val="en-US"/>
+            </w:rPr>
+            <w:t>Mateo, J. M. (2015). Perspectives: Hamilton's Legacy: Mechanisms of Kin Recognition in Humans.</w:t>
+          </w:r>
+          <w:bookmarkEnd w:id="14"/>
+          <w:r>
+            <w:rPr>
+              <w:lang w:val="en-US"/>
+            </w:rPr>
+            <w:t xml:space="preserve"> </w:t>
+          </w:r>
+          <w:r>
+            <w:rPr>
+              <w:i/>
+              <w:lang w:val="en-US"/>
+            </w:rPr>
+            <w:t>Ethology</w:t>
+          </w:r>
+          <w:r>
+            <w:rPr>
+              <w:lang w:val="en-US"/>
+            </w:rPr>
+            <w:t xml:space="preserve">, </w:t>
+          </w:r>
+          <w:r>
+            <w:rPr>
+              <w:i/>
+              <w:lang w:val="en-US"/>
+            </w:rPr>
+            <w:t>121</w:t>
+          </w:r>
+          <w:r>
+            <w:rPr>
+              <w:lang w:val="en-US"/>
+            </w:rPr>
+            <w:t>(5), 419–427. https://doi.org/10.1111/eth.12358</w:t>
+          </w:r>
+        </w:p>
+        <w:p>
+          <w:pPr>
+            <w:pStyle w:val="CitaviBibliographyEntry"/>
+          </w:pPr>
+          <w:bookmarkStart w:id="15" w:name="_CTVL0015b69d468d9074575b75d44ca5cf2c5d1"/>
+          <w:r>
+            <w:rPr>
+              <w:lang w:val="en-US"/>
+            </w:rPr>
+            <w:t>Maurer, D., &amp; Landis, T. (1990). Role of bone conduction in the self-perception of speech.</w:t>
+          </w:r>
+          <w:bookmarkEnd w:id="15"/>
+          <w:r>
+            <w:rPr>
+              <w:lang w:val="en-US"/>
+            </w:rPr>
+            <w:t xml:space="preserve"> </w:t>
+          </w:r>
+          <w:r>
+            <w:rPr>
+              <w:i/>
+            </w:rPr>
+            <w:t>Folia Phoniatrica</w:t>
+          </w:r>
+          <w:r>
+            <w:t xml:space="preserve">, </w:t>
+          </w:r>
+          <w:r>
+            <w:rPr>
+              <w:i/>
+            </w:rPr>
+            <w:t>42</w:t>
+          </w:r>
+          <w:r>
+            <w:t>(5), 226–229. https://doi.org/10.1159/000266070</w:t>
+          </w:r>
+        </w:p>
+        <w:p>
+          <w:pPr>
+            <w:pStyle w:val="CitaviBibliographyEntry"/>
+            <w:rPr>
+              <w:lang w:val="en-US"/>
+            </w:rPr>
+          </w:pPr>
+          <w:bookmarkStart w:id="16" w:name="_CTVL001872a0bd54a2d42f483613d3eb82d0fe3"/>
+          <w:r>
+            <w:t xml:space="preserve">Nussbaum, C., Frühholz, S., &amp; Schweinberger, S. R. (2025). </w:t>
+          </w:r>
+          <w:r>
+            <w:rPr>
+              <w:lang w:val="en-US"/>
+            </w:rPr>
+            <w:t>Understanding voice naturalness.</w:t>
+          </w:r>
+          <w:bookmarkEnd w:id="16"/>
+          <w:r>
+            <w:rPr>
+              <w:lang w:val="en-US"/>
+            </w:rPr>
+            <w:t xml:space="preserve"> </w:t>
+          </w:r>
+          <w:r>
+            <w:rPr>
+              <w:i/>
+              <w:lang w:val="en-US"/>
+            </w:rPr>
+            <w:t>Trends in Cognitive Sciences</w:t>
+          </w:r>
+          <w:r>
+            <w:rPr>
+              <w:lang w:val="en-US"/>
+            </w:rPr>
+            <w:t xml:space="preserve">, </w:t>
+          </w:r>
+          <w:r>
+            <w:rPr>
+              <w:i/>
+              <w:lang w:val="en-US"/>
+            </w:rPr>
+            <w:t>29</w:t>
+          </w:r>
+          <w:r>
+            <w:rPr>
+              <w:lang w:val="en-US"/>
+            </w:rPr>
+            <w:t>(5), 467–480. https://doi.org/10.1016/j.tics.2025.01.010</w:t>
+          </w:r>
+        </w:p>
+        <w:p>
+          <w:pPr>
+            <w:pStyle w:val="CitaviBibliographyEntry"/>
+            <w:rPr>
+              <w:lang w:val="en-US"/>
+            </w:rPr>
+          </w:pPr>
+          <w:bookmarkStart w:id="17" w:name="_CTVL001caa0761a4b40485d8947aa87caf17b69"/>
+          <w:r>
+            <w:rPr>
+              <w:lang w:val="en-US"/>
+            </w:rPr>
+            <w:t>Orepic, P., Kannape, O. A., Faivre, N., &amp; Blanke, O. (2023). Bone conduction facilitates self-other voice discrimination.</w:t>
+          </w:r>
+          <w:bookmarkEnd w:id="17"/>
+          <w:r>
+            <w:rPr>
+              <w:lang w:val="en-US"/>
+            </w:rPr>
+            <w:t xml:space="preserve"> </w:t>
+          </w:r>
+          <w:r>
+            <w:rPr>
+              <w:i/>
+              <w:lang w:val="en-US"/>
+            </w:rPr>
+            <w:t>Royal Society Open Science</w:t>
+          </w:r>
+          <w:r>
+            <w:rPr>
+              <w:lang w:val="en-US"/>
+            </w:rPr>
+            <w:t xml:space="preserve">, </w:t>
+          </w:r>
+          <w:r>
+            <w:rPr>
+              <w:i/>
+              <w:lang w:val="en-US"/>
+            </w:rPr>
+            <w:t>10</w:t>
+          </w:r>
+          <w:r>
+            <w:rPr>
+              <w:lang w:val="en-US"/>
+            </w:rPr>
+            <w:t>(2), 221561. https://doi.org/10.1098/rsos.221561</w:t>
+          </w:r>
+        </w:p>
+        <w:p>
+          <w:pPr>
+            <w:pStyle w:val="CitaviBibliographyEntry"/>
+            <w:rPr>
+              <w:lang w:val="en-US"/>
+            </w:rPr>
+          </w:pPr>
+          <w:bookmarkStart w:id="18" w:name="_CTVL0010ac44d77870a43299b6dc953088d6398"/>
+          <w:r>
+            <w:rPr>
+              <w:lang w:val="en-US"/>
+            </w:rPr>
+            <w:t>Orepic, P., &amp; Pinheiro, A. P. (2026). From Voice to Self: An Integrative Framework on Self-Voice Processing.</w:t>
+          </w:r>
+          <w:bookmarkEnd w:id="18"/>
+          <w:r>
+            <w:rPr>
+              <w:lang w:val="en-US"/>
+            </w:rPr>
+            <w:t xml:space="preserve"> </w:t>
+          </w:r>
+          <w:r>
+            <w:rPr>
+              <w:i/>
+              <w:lang w:val="en-US"/>
+            </w:rPr>
+            <w:t>Perspect Psychol Sci</w:t>
+          </w:r>
+          <w:r>
+            <w:rPr>
+              <w:lang w:val="en-US"/>
+            </w:rPr>
+            <w:t>, 17456916261422585. https://doi.org/10.1177/17456916261422585</w:t>
+          </w:r>
+        </w:p>
+        <w:p>
+          <w:pPr>
+            <w:pStyle w:val="CitaviBibliographyEntry"/>
+            <w:rPr>
+              <w:lang w:val="en-US"/>
+            </w:rPr>
+          </w:pPr>
+          <w:bookmarkStart w:id="19" w:name="_CTVL001b9676ab1e5684c59b62432858caa6e4f"/>
+          <w:r>
+            <w:rPr>
+              <w:lang w:val="en-US"/>
+            </w:rPr>
+            <w:t>Pandey, A., Le Maguer, S., &amp; Harte, N. (2025). What is Naturalness? In</w:t>
+          </w:r>
+          <w:bookmarkEnd w:id="19"/>
+          <w:r>
+            <w:rPr>
+              <w:lang w:val="en-US"/>
+            </w:rPr>
+            <w:t xml:space="preserve"> </w:t>
+          </w:r>
+          <w:r>
+            <w:rPr>
+              <w:i/>
+              <w:lang w:val="en-US"/>
+            </w:rPr>
+            <w:t xml:space="preserve">13th edition of the Speech Synthesis Workshop </w:t>
+          </w:r>
+          <w:r>
+            <w:rPr>
+              <w:lang w:val="en-US"/>
+            </w:rPr>
+            <w:t>(pp. 215–221). ISCA. https://doi.org/10.21437/SSW.2025-33</w:t>
+          </w:r>
+        </w:p>
+        <w:p>
+          <w:pPr>
+            <w:pStyle w:val="CitaviBibliographyEntry"/>
+            <w:rPr>
+              <w:lang w:val="en-US"/>
+            </w:rPr>
+          </w:pPr>
+          <w:bookmarkStart w:id="20" w:name="_CTVL0015455222ba26a4de58c36fd167329696a"/>
           <w:r>
             <w:rPr>
               <w:lang w:val="en-US"/>
             </w:rPr>
             <w:t>Pinheiro, A. P. (2025). Beyond acoustics: Self-relevance as a key to voice naturalness (L).</w:t>
           </w:r>
-          <w:bookmarkEnd w:id="6"/>
+          <w:bookmarkEnd w:id="20"/>
           <w:r>
             <w:rPr>
               <w:lang w:val="en-US"/>
@@ -7228,6 +7153,258 @@
               <w:lang w:val="en-US"/>
             </w:rPr>
             <w:t>(5), 4045–4047. https://doi.org/10.1121/10.0039927</w:t>
+          </w:r>
+        </w:p>
+        <w:p>
+          <w:pPr>
+            <w:pStyle w:val="CitaviBibliographyEntry"/>
+            <w:rPr>
+              <w:lang w:val="en-US"/>
+            </w:rPr>
+          </w:pPr>
+          <w:bookmarkStart w:id="21" w:name="_CTVL001a39a77e7e22244a7a4f44c22f73ff172"/>
+          <w:r>
+            <w:rPr>
+              <w:lang w:val="en-US"/>
+            </w:rPr>
+            <w:t>Pinheiro, A. P., Sarzedas, J., Roberto, M. S., &amp; Kotz, S. A. (2023). Attention and emotion shape self-voice prioritization in speech processing.</w:t>
+          </w:r>
+          <w:bookmarkEnd w:id="21"/>
+          <w:r>
+            <w:rPr>
+              <w:lang w:val="en-US"/>
+            </w:rPr>
+            <w:t xml:space="preserve"> </w:t>
+          </w:r>
+          <w:r>
+            <w:rPr>
+              <w:i/>
+              <w:lang w:val="en-US"/>
+            </w:rPr>
+            <w:t>Cortex; a Journal Devoted to the Study of the Nervous System and Behavior</w:t>
+          </w:r>
+          <w:r>
+            <w:rPr>
+              <w:lang w:val="en-US"/>
+            </w:rPr>
+            <w:t xml:space="preserve">, </w:t>
+          </w:r>
+          <w:r>
+            <w:rPr>
+              <w:i/>
+              <w:lang w:val="en-US"/>
+            </w:rPr>
+            <w:t>158</w:t>
+          </w:r>
+          <w:r>
+            <w:rPr>
+              <w:lang w:val="en-US"/>
+            </w:rPr>
+            <w:t>, 83–95. https://doi.org/10.1016/j.cortex.2022.10.006</w:t>
+          </w:r>
+        </w:p>
+        <w:p>
+          <w:pPr>
+            <w:pStyle w:val="CitaviBibliographyEntry"/>
+          </w:pPr>
+          <w:bookmarkStart w:id="22" w:name="_CTVL0019e12c96527c34f3d810bbf0dbdadc8ac"/>
+          <w:r>
+            <w:rPr>
+              <w:lang w:val="en-US"/>
+            </w:rPr>
+            <w:t>Platek, S. M., &amp; Kemp, S. M. (2009). Is family special to the brain? An event-related fMRI study of familiar, familial, and self-face recognition.</w:t>
+          </w:r>
+          <w:bookmarkEnd w:id="22"/>
+          <w:r>
+            <w:rPr>
+              <w:lang w:val="en-US"/>
+            </w:rPr>
+            <w:t xml:space="preserve"> </w:t>
+          </w:r>
+          <w:r>
+            <w:rPr>
+              <w:i/>
+            </w:rPr>
+            <w:t>Neuropsychologia</w:t>
+          </w:r>
+          <w:r>
+            <w:t xml:space="preserve">, </w:t>
+          </w:r>
+          <w:r>
+            <w:rPr>
+              <w:i/>
+            </w:rPr>
+            <w:t>47</w:t>
+          </w:r>
+          <w:r>
+            <w:t>(3), 849–858. https://doi.org/10.1016/j.neuropsychologia.2008.12.027</w:t>
+          </w:r>
+        </w:p>
+        <w:p>
+          <w:pPr>
+            <w:pStyle w:val="CitaviBibliographyEntry"/>
+            <w:rPr>
+              <w:lang w:val="en-US"/>
+            </w:rPr>
+          </w:pPr>
+          <w:bookmarkStart w:id="23" w:name="_CTVL0013ee55c02bf1645a2ab8425de5c036b64"/>
+          <w:r>
+            <w:t xml:space="preserve">Roswandowitz, C., Kathiresan, T., Pellegrino, E., Dellwo, V., &amp; Frühholz, S. (2024). </w:t>
+          </w:r>
+          <w:r>
+            <w:rPr>
+              <w:lang w:val="en-US"/>
+            </w:rPr>
+            <w:t>Cortical-striatal brain network distinguishes deepfake from real speaker identity.</w:t>
+          </w:r>
+          <w:bookmarkEnd w:id="23"/>
+          <w:r>
+            <w:rPr>
+              <w:lang w:val="en-US"/>
+            </w:rPr>
+            <w:t xml:space="preserve"> </w:t>
+          </w:r>
+          <w:r>
+            <w:rPr>
+              <w:i/>
+              <w:lang w:val="en-US"/>
+            </w:rPr>
+            <w:t>Communications Biology</w:t>
+          </w:r>
+          <w:r>
+            <w:rPr>
+              <w:lang w:val="en-US"/>
+            </w:rPr>
+            <w:t xml:space="preserve">, </w:t>
+          </w:r>
+          <w:r>
+            <w:rPr>
+              <w:i/>
+              <w:lang w:val="en-US"/>
+            </w:rPr>
+            <w:t>7</w:t>
+          </w:r>
+          <w:r>
+            <w:rPr>
+              <w:lang w:val="en-US"/>
+            </w:rPr>
+            <w:t>(1), 711. https://doi.org/10.1038/s42003-024-06372-6</w:t>
+          </w:r>
+        </w:p>
+        <w:p>
+          <w:pPr>
+            <w:pStyle w:val="CitaviBibliographyEntry"/>
+          </w:pPr>
+          <w:bookmarkStart w:id="24" w:name="_CTVL001570cf69ac9ac461da2518c18a2951d6f"/>
+          <w:r>
+            <w:rPr>
+              <w:lang w:val="en-US"/>
+            </w:rPr>
+            <w:t>Sui, J., &amp; Humphreys, G. W. (2017). The ubiquitous self: What the properties of self-bias tell us about the self.</w:t>
+          </w:r>
+          <w:bookmarkEnd w:id="24"/>
+          <w:r>
+            <w:rPr>
+              <w:lang w:val="en-US"/>
+            </w:rPr>
+            <w:t xml:space="preserve"> </w:t>
+          </w:r>
+          <w:r>
+            <w:rPr>
+              <w:i/>
+            </w:rPr>
+            <w:t>Ann N Y Acad Sci</w:t>
+          </w:r>
+          <w:r>
+            <w:t xml:space="preserve">, </w:t>
+          </w:r>
+          <w:r>
+            <w:rPr>
+              <w:i/>
+            </w:rPr>
+            <w:t>1396</w:t>
+          </w:r>
+          <w:r>
+            <w:t>(1), 222–235. https://doi.org/10.1111/nyas.13197</w:t>
+          </w:r>
+        </w:p>
+        <w:p>
+          <w:pPr>
+            <w:pStyle w:val="CitaviBibliographyEntry"/>
+          </w:pPr>
+          <w:bookmarkStart w:id="25" w:name="_CTVL0016421526d0c2d4b2185c77145e1496a84"/>
+          <w:r>
+            <w:t>Tsuchiya, A., &amp; Schweinberger, S. R. (2022). Erkennen von Verwandtschaft zu sich Selbst und bei Anderen [Recognition of Kinship to Self and in Others]: Part 2, Issue 1/2022.</w:t>
+          </w:r>
+          <w:bookmarkEnd w:id="25"/>
+          <w:r>
+            <w:t xml:space="preserve"> </w:t>
+          </w:r>
+          <w:r>
+            <w:rPr>
+              <w:i/>
+            </w:rPr>
+            <w:t>In-Mind Magazine</w:t>
+          </w:r>
+          <w:r>
+            <w:t xml:space="preserve">, </w:t>
+          </w:r>
+          <w:r>
+            <w:rPr>
+              <w:i/>
+            </w:rPr>
+            <w:t>1</w:t>
+          </w:r>
+          <w:r>
+            <w:t>(2). https://de.in-mind.org/article/erkennen-von-verwandtschaft-zu-sich-selbst-und-bei-anderen</w:t>
+          </w:r>
+        </w:p>
+        <w:p>
+          <w:pPr>
+            <w:pStyle w:val="CitaviBibliographyEntry"/>
+            <w:rPr>
+              <w:lang w:val="en-US"/>
+            </w:rPr>
+          </w:pPr>
+          <w:bookmarkStart w:id="26" w:name="_CTVL0015f719101a6324ccf8bd88a1b6c297199"/>
+          <w:r>
+            <w:rPr>
+              <w:lang w:val="en-US"/>
+            </w:rPr>
+            <w:t>Yamagishi, J., Veaux, C., King, S., &amp; Renals, S. (2012). Speech synthesis technologies for individuals with vocal disabilities: Voice banking and reconstruction.</w:t>
+          </w:r>
+          <w:bookmarkEnd w:id="26"/>
+          <w:r>
+            <w:rPr>
+              <w:lang w:val="en-US"/>
+            </w:rPr>
+            <w:t xml:space="preserve"> </w:t>
+          </w:r>
+          <w:r>
+            <w:rPr>
+              <w:i/>
+              <w:lang w:val="en-US"/>
+            </w:rPr>
+            <w:t>Acoustical Science and Technology</w:t>
+          </w:r>
+          <w:r>
+            <w:rPr>
+              <w:lang w:val="en-US"/>
+            </w:rPr>
+            <w:t xml:space="preserve">, </w:t>
+          </w:r>
+          <w:r>
+            <w:rPr>
+              <w:i/>
+              <w:lang w:val="en-US"/>
+            </w:rPr>
+            <w:t>33</w:t>
+          </w:r>
+          <w:r>
+            <w:rPr>
+              <w:lang w:val="en-US"/>
+            </w:rPr>
+            <w:t>(1), 1–5. https://doi.org/10.1250/ast.33.1</w:t>
           </w:r>
           <w:r>
             <w:rPr>
@@ -7259,7 +7436,7 @@
 
 <file path=word/comments.xml><?xml version="1.0" encoding="utf-8"?>
 <w:comments xmlns:wpc="http://schemas.microsoft.com/office/word/2010/wordprocessingCanvas" xmlns:cx="http://schemas.microsoft.com/office/drawing/2014/chartex" xmlns:cx1="http://schemas.microsoft.com/office/drawing/2015/9/8/chartex" xmlns:cx2="http://schemas.microsoft.com/office/drawing/2015/10/21/chartex" xmlns:cx3="http://schemas.microsoft.com/office/drawing/2016/5/9/chartex" xmlns:cx4="http://schemas.microsoft.com/office/drawing/2016/5/10/chartex" xmlns:cx5="http://schemas.microsoft.com/office/drawing/2016/5/11/chartex" xmlns:cx6="http://schemas.microsoft.com/office/drawing/2016/5/12/chartex" xmlns:cx7="http://schemas.microsoft.com/office/drawing/2016/5/13/chartex" xmlns:cx8="http://schemas.microsoft.com/office/drawing/2016/5/14/chartex" xmlns:mc="http://schemas.openxmlformats.org/markup-compatibility/2006" xmlns:aink="http://schemas.microsoft.com/office/drawing/2016/ink" xmlns:am3d="http://schemas.microsoft.com/office/drawing/2017/model3d" xmlns:o="urn:schemas-microsoft-com:office:office" xmlns:oel="http://schemas.microsoft.com/office/2019/extlst" xmlns:r="http://schemas.openxmlformats.org/officeDocument/2006/relationships" xmlns:m="http://schemas.openxmlformats.org/officeDocument/2006/math" xmlns:v="urn:schemas-microsoft-com:vml" xmlns:wp14="http://schemas.microsoft.com/office/word/2010/wordprocessingDrawing" xmlns:wp="http://schemas.openxmlformats.org/drawingml/2006/wordprocessingDrawing" xmlns:w10="urn:schemas-microsoft-com:office:word" xmlns:w="http://schemas.openxmlformats.org/wordprocessingml/2006/main" xmlns:w14="http://schemas.microsoft.com/office/word/2010/wordml" xmlns:w15="http://schemas.microsoft.com/office/word/2012/wordml" xmlns:w16cex="http://schemas.microsoft.com/office/word/2018/wordml/cex" xmlns:w16cid="http://schemas.microsoft.com/office/word/2016/wordml/cid" xmlns:w16="http://schemas.microsoft.com/office/word/2018/wordml" xmlns:w16du="http://schemas.microsoft.com/office/word/2023/wordml/word16du" xmlns:w16sdtdh="http://schemas.microsoft.com/office/word/2020/wordml/sdtdatahash" xmlns:w16sdtfl="http://schemas.microsoft.com/office/word/2024/wordml/sdtformatlock" xmlns:w16se="http://schemas.microsoft.com/office/word/2015/wordml/symex" xmlns:wpg="http://schemas.microsoft.com/office/word/2010/wordprocessingGroup" xmlns:wpi="http://schemas.microsoft.com/office/word/2010/wordprocessingInk" xmlns:wne="http://schemas.microsoft.com/office/word/2006/wordml" xmlns:wps="http://schemas.microsoft.com/office/word/2010/wordprocessingShape" mc:Ignorable="w14 w15 w16se w16cid w16 w16cex w16sdtdh w16sdtfl w16du wp14">
-  <w:comment w:id="1" w:author="christine.nussbaum" w:date="2026-05-08T17:35:00Z" w:initials="c">
+  <w:comment w:id="2" w:author="christine.nussbaum" w:date="2026-05-15T15:08:00Z" w:initials="c">
     <w:p>
       <w:pPr>
         <w:pStyle w:val="Kommentartext"/>
@@ -7271,11 +7448,11 @@
         <w:annotationRef/>
       </w:r>
       <w:r>
-        <w:t>Müssen wir dann nochmal anpassen</w:t>
+        <w:t xml:space="preserve">Achtung: ich habe hier fast einen kompletten Absatzrausgenommen, inklusive 2-3 Zitationen, sonst wäre es einfach zzu lang geworden. </w:t>
       </w:r>
     </w:p>
   </w:comment>
-  <w:comment w:id="2" w:author="christine.nussbaum" w:date="2026-05-08T17:47:00Z" w:initials="c">
+  <w:comment w:id="3" w:author="christine.nussbaum" w:date="2026-05-15T15:30:00Z" w:initials="c">
     <w:p>
       <w:pPr>
         <w:pStyle w:val="Kommentartext"/>
@@ -7287,11 +7464,11 @@
         <w:annotationRef/>
       </w:r>
       <w:r>
-        <w:t>Weiß nicht ob ich mir der Überschrift so zufrieden bin</w:t>
+        <w:t xml:space="preserve">Bisschen gekürzt, aber inhalte sind noch drin. </w:t>
       </w:r>
     </w:p>
   </w:comment>
-  <w:comment w:id="3" w:author="christine.nussbaum" w:date="2026-05-08T18:04:00Z" w:initials="c">
+  <w:comment w:id="4" w:author="christine.nussbaum" w:date="2026-05-15T16:20:00Z" w:initials="c">
     <w:p>
       <w:pPr>
         <w:pStyle w:val="Kommentartext"/>
@@ -7303,7 +7480,23 @@
         <w:annotationRef/>
       </w:r>
       <w:r>
-        <w:t>Ich muss zugeben, dass ich den Punkt des Reviewers hier schon sehe, dass dieser Absatz irgendwie bisschen aus der Reihe tanzt und nicht so richtig klar ist, wieso der heir drin ist. Vllt können wir ihn nochmal ein wenig kürzen bzw streamlinen?</w:t>
+        <w:t xml:space="preserve">Den kleinen Seitenhieb konnte ich mir dann doch nicht verkneifen… </w:t>
+      </w:r>
+    </w:p>
+  </w:comment>
+  <w:comment w:id="5" w:author="christine.nussbaum" w:date="2026-05-15T15:53:00Z" w:initials="c">
+    <w:p>
+      <w:pPr>
+        <w:pStyle w:val="Kommentartext"/>
+      </w:pPr>
+      <w:r>
+        <w:rPr>
+          <w:rStyle w:val="Kommentarzeichen"/>
+        </w:rPr>
+        <w:annotationRef/>
+      </w:r>
+      <w:r>
+        <w:t xml:space="preserve">Habe die conclusion rausgekürzt. So isses für mich auch rund. </w:t>
       </w:r>
     </w:p>
   </w:comment>
@@ -7312,25 +7505,28 @@
 
 <file path=word/commentsExtended.xml><?xml version="1.0" encoding="utf-8"?>
 <w15:commentsEx xmlns:wpc="http://schemas.microsoft.com/office/word/2010/wordprocessingCanvas" xmlns:cx="http://schemas.microsoft.com/office/drawing/2014/chartex" xmlns:cx1="http://schemas.microsoft.com/office/drawing/2015/9/8/chartex" xmlns:cx2="http://schemas.microsoft.com/office/drawing/2015/10/21/chartex" xmlns:cx3="http://schemas.microsoft.com/office/drawing/2016/5/9/chartex" xmlns:cx4="http://schemas.microsoft.com/office/drawing/2016/5/10/chartex" xmlns:cx5="http://schemas.microsoft.com/office/drawing/2016/5/11/chartex" xmlns:cx6="http://schemas.microsoft.com/office/drawing/2016/5/12/chartex" xmlns:cx7="http://schemas.microsoft.com/office/drawing/2016/5/13/chartex" xmlns:cx8="http://schemas.microsoft.com/office/drawing/2016/5/14/chartex" xmlns:mc="http://schemas.openxmlformats.org/markup-compatibility/2006" xmlns:aink="http://schemas.microsoft.com/office/drawing/2016/ink" xmlns:am3d="http://schemas.microsoft.com/office/drawing/2017/model3d" xmlns:o="urn:schemas-microsoft-com:office:office" xmlns:oel="http://schemas.microsoft.com/office/2019/extlst" xmlns:r="http://schemas.openxmlformats.org/officeDocument/2006/relationships" xmlns:m="http://schemas.openxmlformats.org/officeDocument/2006/math" xmlns:v="urn:schemas-microsoft-com:vml" xmlns:wp14="http://schemas.microsoft.com/office/word/2010/wordprocessingDrawing" xmlns:wp="http://schemas.openxmlformats.org/drawingml/2006/wordprocessingDrawing" xmlns:w10="urn:schemas-microsoft-com:office:word" xmlns:w="http://schemas.openxmlformats.org/wordprocessingml/2006/main" xmlns:w14="http://schemas.microsoft.com/office/word/2010/wordml" xmlns:w15="http://schemas.microsoft.com/office/word/2012/wordml" xmlns:w16cex="http://schemas.microsoft.com/office/word/2018/wordml/cex" xmlns:w16cid="http://schemas.microsoft.com/office/word/2016/wordml/cid" xmlns:w16="http://schemas.microsoft.com/office/word/2018/wordml" xmlns:w16du="http://schemas.microsoft.com/office/word/2023/wordml/word16du" xmlns:w16sdtdh="http://schemas.microsoft.com/office/word/2020/wordml/sdtdatahash" xmlns:w16sdtfl="http://schemas.microsoft.com/office/word/2024/wordml/sdtformatlock" xmlns:w16se="http://schemas.microsoft.com/office/word/2015/wordml/symex" xmlns:wpg="http://schemas.microsoft.com/office/word/2010/wordprocessingGroup" xmlns:wpi="http://schemas.microsoft.com/office/word/2010/wordprocessingInk" xmlns:wne="http://schemas.microsoft.com/office/word/2006/wordml" xmlns:wps="http://schemas.microsoft.com/office/word/2010/wordprocessingShape" mc:Ignorable="w14 w15 w16se w16cid w16 w16cex w16sdtdh w16sdtfl w16du wp14">
-  <w15:commentEx w15:paraId="6400A17B" w15:done="0"/>
-  <w15:commentEx w15:paraId="3C6FB450" w15:done="0"/>
-  <w15:commentEx w15:paraId="542BFBD0" w15:done="0"/>
+  <w15:commentEx w15:paraId="212B6737" w15:done="0"/>
+  <w15:commentEx w15:paraId="4AF81385" w15:done="0"/>
+  <w15:commentEx w15:paraId="1711DF6D" w15:done="0"/>
+  <w15:commentEx w15:paraId="339F6882" w15:done="0"/>
 </w15:commentsEx>
 </file>
 
 <file path=word/commentsExtensible.xml><?xml version="1.0" encoding="utf-8"?>
 <w16cex:commentsExtensible xmlns:wpc="http://schemas.microsoft.com/office/word/2010/wordprocessingCanvas" xmlns:cx="http://schemas.microsoft.com/office/drawing/2014/chartex" xmlns:cx1="http://schemas.microsoft.com/office/drawing/2015/9/8/chartex" xmlns:cx2="http://schemas.microsoft.com/office/drawing/2015/10/21/chartex" xmlns:cx3="http://schemas.microsoft.com/office/drawing/2016/5/9/chartex" xmlns:cx4="http://schemas.microsoft.com/office/drawing/2016/5/10/chartex" xmlns:cx5="http://schemas.microsoft.com/office/drawing/2016/5/11/chartex" xmlns:cx6="http://schemas.microsoft.com/office/drawing/2016/5/12/chartex" xmlns:cx7="http://schemas.microsoft.com/office/drawing/2016/5/13/chartex" xmlns:cx8="http://schemas.microsoft.com/office/drawing/2016/5/14/chartex" xmlns:cr="http://schemas.microsoft.com/office/comments/2020/reactions" xmlns:mc="http://schemas.openxmlformats.org/markup-compatibility/2006" xmlns:aink="http://schemas.microsoft.com/office/drawing/2016/ink" xmlns:am3d="http://schemas.microsoft.com/office/drawing/2017/model3d" xmlns:o="urn:schemas-microsoft-com:office:office" xmlns:oel="http://schemas.microsoft.com/office/2019/extlst" xmlns:r="http://schemas.openxmlformats.org/officeDocument/2006/relationships" xmlns:m="http://schemas.openxmlformats.org/officeDocument/2006/math" xmlns:v="urn:schemas-microsoft-com:vml" xmlns:wp14="http://schemas.microsoft.com/office/word/2010/wordprocessingDrawing" xmlns:wp="http://schemas.openxmlformats.org/drawingml/2006/wordprocessingDrawing" xmlns:w10="urn:schemas-microsoft-com:office:word" xmlns:w="http://schemas.openxmlformats.org/wordprocessingml/2006/main" xmlns:w14="http://schemas.microsoft.com/office/word/2010/wordml" xmlns:w15="http://schemas.microsoft.com/office/word/2012/wordml" xmlns:w16cex="http://schemas.microsoft.com/office/word/2018/wordml/cex" xmlns:w16cid="http://schemas.microsoft.com/office/word/2016/wordml/cid" xmlns:w16="http://schemas.microsoft.com/office/word/2018/wordml" xmlns:w16du="http://schemas.microsoft.com/office/word/2023/wordml/word16du" xmlns:w16sdtdh="http://schemas.microsoft.com/office/word/2020/wordml/sdtdatahash" xmlns:w16sdtfl="http://schemas.microsoft.com/office/word/2024/wordml/sdtformatlock" xmlns:w16se="http://schemas.microsoft.com/office/word/2015/wordml/symex" xmlns:wpg="http://schemas.microsoft.com/office/word/2010/wordprocessingGroup" xmlns:wpi="http://schemas.microsoft.com/office/word/2010/wordprocessingInk" xmlns:wne="http://schemas.microsoft.com/office/word/2006/wordml" xmlns:wps="http://schemas.microsoft.com/office/word/2010/wordprocessingShape" mc:Ignorable="w14 w15 w16se w16cid w16 w16cex w16sdtdh w16sdtfl cr w16du wp14">
-  <w16cex:commentExtensible w16cex:durableId="5CBD75C5" w16cex:dateUtc="2026-05-08T15:35:00Z"/>
-  <w16cex:commentExtensible w16cex:durableId="5556E940" w16cex:dateUtc="2026-05-08T15:47:00Z"/>
-  <w16cex:commentExtensible w16cex:durableId="0DA191FE" w16cex:dateUtc="2026-05-08T16:04:00Z"/>
+  <w16cex:commentExtensible w16cex:durableId="2198058F" w16cex:dateUtc="2026-05-15T13:08:00Z"/>
+  <w16cex:commentExtensible w16cex:durableId="315CBEED" w16cex:dateUtc="2026-05-15T13:30:00Z"/>
+  <w16cex:commentExtensible w16cex:durableId="255D1B71" w16cex:dateUtc="2026-05-15T14:20:00Z"/>
+  <w16cex:commentExtensible w16cex:durableId="15E039AF" w16cex:dateUtc="2026-05-15T13:53:00Z"/>
 </w16cex:commentsExtensible>
 </file>
 
 <file path=word/commentsIds.xml><?xml version="1.0" encoding="utf-8"?>
 <w16cid:commentsIds xmlns:wpc="http://schemas.microsoft.com/office/word/2010/wordprocessingCanvas" xmlns:cx="http://schemas.microsoft.com/office/drawing/2014/chartex" xmlns:cx1="http://schemas.microsoft.com/office/drawing/2015/9/8/chartex" xmlns:cx2="http://schemas.microsoft.com/office/drawing/2015/10/21/chartex" xmlns:cx3="http://schemas.microsoft.com/office/drawing/2016/5/9/chartex" xmlns:cx4="http://schemas.microsoft.com/office/drawing/2016/5/10/chartex" xmlns:cx5="http://schemas.microsoft.com/office/drawing/2016/5/11/chartex" xmlns:cx6="http://schemas.microsoft.com/office/drawing/2016/5/12/chartex" xmlns:cx7="http://schemas.microsoft.com/office/drawing/2016/5/13/chartex" xmlns:cx8="http://schemas.microsoft.com/office/drawing/2016/5/14/chartex" xmlns:mc="http://schemas.openxmlformats.org/markup-compatibility/2006" xmlns:aink="http://schemas.microsoft.com/office/drawing/2016/ink" xmlns:am3d="http://schemas.microsoft.com/office/drawing/2017/model3d" xmlns:o="urn:schemas-microsoft-com:office:office" xmlns:oel="http://schemas.microsoft.com/office/2019/extlst" xmlns:r="http://schemas.openxmlformats.org/officeDocument/2006/relationships" xmlns:m="http://schemas.openxmlformats.org/officeDocument/2006/math" xmlns:v="urn:schemas-microsoft-com:vml" xmlns:wp14="http://schemas.microsoft.com/office/word/2010/wordprocessingDrawing" xmlns:wp="http://schemas.openxmlformats.org/drawingml/2006/wordprocessingDrawing" xmlns:w10="urn:schemas-microsoft-com:office:word" xmlns:w="http://schemas.openxmlformats.org/wordprocessingml/2006/main" xmlns:w14="http://schemas.microsoft.com/office/word/2010/wordml" xmlns:w15="http://schemas.microsoft.com/office/word/2012/wordml" xmlns:w16cex="http://schemas.microsoft.com/office/word/2018/wordml/cex" xmlns:w16cid="http://schemas.microsoft.com/office/word/2016/wordml/cid" xmlns:w16="http://schemas.microsoft.com/office/word/2018/wordml" xmlns:w16du="http://schemas.microsoft.com/office/word/2023/wordml/word16du" xmlns:w16sdtdh="http://schemas.microsoft.com/office/word/2020/wordml/sdtdatahash" xmlns:w16sdtfl="http://schemas.microsoft.com/office/word/2024/wordml/sdtformatlock" xmlns:w16se="http://schemas.microsoft.com/office/word/2015/wordml/symex" xmlns:wpg="http://schemas.microsoft.com/office/word/2010/wordprocessingGroup" xmlns:wpi="http://schemas.microsoft.com/office/word/2010/wordprocessingInk" xmlns:wne="http://schemas.microsoft.com/office/word/2006/wordml" xmlns:wps="http://schemas.microsoft.com/office/word/2010/wordprocessingShape" mc:Ignorable="w14 w15 w16se w16cid w16 w16cex w16sdtdh w16sdtfl w16du wp14">
-  <w16cid:commentId w16cid:paraId="6400A17B" w16cid:durableId="5CBD75C5"/>
-  <w16cid:commentId w16cid:paraId="3C6FB450" w16cid:durableId="5556E940"/>
-  <w16cid:commentId w16cid:paraId="542BFBD0" w16cid:durableId="0DA191FE"/>
+  <w16cid:commentId w16cid:paraId="212B6737" w16cid:durableId="2198058F"/>
+  <w16cid:commentId w16cid:paraId="4AF81385" w16cid:durableId="315CBEED"/>
+  <w16cid:commentId w16cid:paraId="1711DF6D" w16cid:durableId="255D1B71"/>
+  <w16cid:commentId w16cid:paraId="339F6882" w16cid:durableId="15E039AF"/>
 </w16cid:commentsIds>
 </file>
 
@@ -8593,6 +8789,7 @@
   <w:style w:type="character" w:default="1" w:styleId="Absatz-Standardschriftart">
     <w:name w:val="Default Paragraph Font"/>
     <w:uiPriority w:val="1"/>
+    <w:semiHidden/>
     <w:unhideWhenUsed/>
   </w:style>
   <w:style w:type="table" w:default="1" w:styleId="NormaleTabelle">
@@ -9375,6 +9572,13 @@
     <w:pitch w:val="variable"/>
     <w:sig w:usb0="E4002EFF" w:usb1="C000E47F" w:usb2="00000009" w:usb3="00000000" w:csb0="000001FF" w:csb1="00000000"/>
   </w:font>
+  <w:font w:name="Cambria Math">
+    <w:panose1 w:val="02040503050406030204"/>
+    <w:charset w:val="00"/>
+    <w:family w:val="roman"/>
+    <w:pitch w:val="variable"/>
+    <w:sig w:usb0="E00006FF" w:usb1="420024FF" w:usb2="02000000" w:usb3="00000000" w:csb0="0000019F" w:csb1="00000000"/>
+  </w:font>
   <w:font w:name="Aptos">
     <w:charset w:val="00"/>
     <w:family w:val="swiss"/>
@@ -9411,6 +9615,7 @@
     <w:rsid w:val="000C0311"/>
     <w:rsid w:val="0010630C"/>
     <w:rsid w:val="00122DAD"/>
+    <w:rsid w:val="00135B4F"/>
     <w:rsid w:val="001A0297"/>
     <w:rsid w:val="00213A4D"/>
     <w:rsid w:val="00234930"/>
@@ -9427,18 +9632,24 @@
     <w:rsid w:val="00585E27"/>
     <w:rsid w:val="00586718"/>
     <w:rsid w:val="005C29A7"/>
+    <w:rsid w:val="0061350E"/>
     <w:rsid w:val="006D7EFD"/>
+    <w:rsid w:val="007D2506"/>
     <w:rsid w:val="007D3C09"/>
     <w:rsid w:val="007D512B"/>
     <w:rsid w:val="007E6F05"/>
     <w:rsid w:val="00913557"/>
     <w:rsid w:val="009841C2"/>
     <w:rsid w:val="009B54B6"/>
+    <w:rsid w:val="009D35F1"/>
     <w:rsid w:val="009F7D1D"/>
     <w:rsid w:val="00A006C6"/>
     <w:rsid w:val="00A719B4"/>
+    <w:rsid w:val="00AA0CB4"/>
+    <w:rsid w:val="00B17A47"/>
     <w:rsid w:val="00B22DDA"/>
     <w:rsid w:val="00B45595"/>
+    <w:rsid w:val="00BF73DA"/>
     <w:rsid w:val="00C431EF"/>
     <w:rsid w:val="00C61A35"/>
     <w:rsid w:val="00C91249"/>
@@ -9448,6 +9659,7 @@
     <w:rsid w:val="00E56A53"/>
     <w:rsid w:val="00EE451C"/>
     <w:rsid w:val="00F03D91"/>
+    <w:rsid w:val="00F46AC5"/>
     <w:rsid w:val="00F73EFB"/>
     <w:rsid w:val="00FB4724"/>
   </w:rsids>
@@ -9905,7 +10117,7 @@
     <w:basedOn w:val="Absatz-Standardschriftart"/>
     <w:uiPriority w:val="99"/>
     <w:semiHidden/>
-    <w:rsid w:val="00C431EF"/>
+    <w:rsid w:val="00F46AC5"/>
     <w:rPr>
       <w:color w:val="666666"/>
     </w:rPr>

</xml_diff>